<commit_message>
Normalize medical dialogues for Japanese broker use
</commit_message>
<xml_diff>
--- a/18_DOCX/MED_DIALOGUES_0006_0010.docx
+++ b/18_DOCX/MED_DIALOGUES_0006_0010.docx
@@ -15,7 +15,7 @@
         <w:pStyle w:val="ListBullet"/>
       </w:pPr>
       <w:r>
-        <w:t>Versão: 0.1</w:t>
+        <w:t>Versão: 0.2</w:t>
       </w:r>
     </w:p>
     <w:p>
@@ -39,7 +39,7 @@
         <w:pStyle w:val="Heading1"/>
       </w:pPr>
       <w:r>
-        <w:t>DIALOGUE-MED-0006 - Solicitação de benefício e atestado médico</w:t>
+        <w:t>DIALOGUE-MED-0006 - Solicitação de benefício e documentos médicos</w:t>
       </w:r>
     </w:p>
     <w:p>
@@ -55,7 +55,7 @@
         <w:pStyle w:val="ListBullet"/>
       </w:pPr>
       <w:r>
-        <w:t>Versão: 0.1</w:t>
+        <w:t>Versão: 0.2</w:t>
       </w:r>
     </w:p>
     <w:p>
@@ -79,7 +79,7 @@
         <w:pStyle w:val="ListBullet"/>
       </w:pPr>
       <w:r>
-        <w:t>Histórico: Criação inicial.</w:t>
+        <w:t>Histórico: Normalização bilíngue para uso por corretor japonês no NotebookLM.</w:t>
       </w:r>
     </w:p>
     <w:p>
@@ -118,7 +118,7 @@
     </w:p>
     <w:p>
       <w:r>
-        <w:t>Cliente recebeu atendimento médico e quer saber como iniciar a solicitação.</w:t>
+        <w:t>Cliente recebeu atendimento médico e quer iniciar a solicitação de benefício.</w:t>
       </w:r>
     </w:p>
     <w:p>
@@ -126,12 +126,36 @@
         <w:pStyle w:val="Heading2"/>
       </w:pPr>
       <w:r>
+        <w:t>Participantes</w:t>
+      </w:r>
+    </w:p>
+    <w:p>
+      <w:pPr>
+        <w:pStyle w:val="ListBullet"/>
+      </w:pPr>
+      <w:r>
+        <w:t>Corretor: corretor japonês</w:t>
+      </w:r>
+    </w:p>
+    <w:p>
+      <w:pPr>
+        <w:pStyle w:val="ListBullet"/>
+      </w:pPr>
+      <w:r>
+        <w:t>Cliente: cliente brasileiro residente no Japão</w:t>
+      </w:r>
+    </w:p>
+    <w:p>
+      <w:pPr>
+        <w:pStyle w:val="Heading2"/>
+      </w:pPr>
+      <w:r>
         <w:t>Objetivo do diálogo</w:t>
       </w:r>
     </w:p>
     <w:p>
       <w:r>
-        <w:t>Explicar em português simples o fluxo de documentos e análise, preservando a precisão do termo japonês.</w:t>
+        <w:t>Explicar o fluxo inicial de solicitação, atestado médico, recibo e detalhamento de atendimento.</w:t>
       </w:r>
     </w:p>
     <w:p>
@@ -139,7 +163,73 @@
         <w:pStyle w:val="Heading2"/>
       </w:pPr>
       <w:r>
-        <w:t>Diálogo</w:t>
+        <w:t>Versão em japonês</w:t>
+      </w:r>
+    </w:p>
+    <w:p>
+      <w:r>
+        <w:t>**Corretor:** 給付金請求には、保険会社が指定する書類が必要です。</w:t>
+      </w:r>
+    </w:p>
+    <w:p>
+      <w:r>
+        <w:t>**Cliente:** それはポルトガル語でお客様にどう説明すればよいですか。</w:t>
+      </w:r>
+    </w:p>
+    <w:p>
+      <w:r>
+        <w:t>**Corretor:** 診断書、領収書、診療明細書を確認しましょう。</w:t>
+      </w:r>
+    </w:p>
+    <w:p>
+      <w:r>
+        <w:t>**Cliente:** 支払いを約束してもよいですか。</w:t>
+      </w:r>
+    </w:p>
+    <w:p>
+      <w:r>
+        <w:t>**Corretor:** 書類に不足があると査定が止まる場合があります。</w:t>
+      </w:r>
+    </w:p>
+    <w:p>
+      <w:pPr>
+        <w:pStyle w:val="Heading2"/>
+      </w:pPr>
+      <w:r>
+        <w:t>Versão em português brasileiro</w:t>
+      </w:r>
+    </w:p>
+    <w:p>
+      <w:r>
+        <w:t>**Corretor:** Para pedir o benefício, precisamos seguir a lista de documentos da seguradora.</w:t>
+      </w:r>
+    </w:p>
+    <w:p>
+      <w:r>
+        <w:t>**Cliente:** Então isso já garante o pagamento?</w:t>
+      </w:r>
+    </w:p>
+    <w:p>
+      <w:r>
+        <w:t>**Corretor:** Vamos conferir atestado médico, recibo e detalhamento do atendimento.</w:t>
+      </w:r>
+    </w:p>
+    <w:p>
+      <w:r>
+        <w:t>**Cliente:** O que eu preciso fazer agora?</w:t>
+      </w:r>
+    </w:p>
+    <w:p>
+      <w:r>
+        <w:t>**Corretor:** Se faltar documento, a análise pode ficar parada até a correção.</w:t>
+      </w:r>
+    </w:p>
+    <w:p>
+      <w:pPr>
+        <w:pStyle w:val="Heading2"/>
+      </w:pPr>
+      <w:r>
+        <w:t>Notas culturais ou comerciais</w:t>
       </w:r>
     </w:p>
     <w:p>
@@ -147,7 +237,7 @@
         <w:pStyle w:val="ListBullet"/>
       </w:pPr>
       <w:r>
-        <w:t>Corretor: Vamos organizar a solicitação por etapas.</w:t>
+        <w:t>Confirmar documentos e condições antes de orientar o cliente.</w:t>
       </w:r>
     </w:p>
     <w:p>
@@ -155,7 +245,7 @@
         <w:pStyle w:val="ListBullet"/>
       </w:pPr>
       <w:r>
-        <w:t>Cliente: Eu preciso entregar todos os documentos agora?</w:t>
+        <w:t>Não prometer aceitação, cobertura ou pagamento antes da análise da seguradora.</w:t>
       </w:r>
     </w:p>
     <w:p>
@@ -163,7 +253,15 @@
         <w:pStyle w:val="ListBullet"/>
       </w:pPr>
       <w:r>
-        <w:t>Corretor: Primeiro confirmamos o tipo de benefício e depois a lista exigida pela seguradora.</w:t>
+        <w:t>Usar português simples e evitar tradução literal quando prejudicar a compreensão.</w:t>
+      </w:r>
+    </w:p>
+    <w:p>
+      <w:pPr>
+        <w:pStyle w:val="Heading2"/>
+      </w:pPr>
+      <w:r>
+        <w:t>Pontos de atenção para o corretor</w:t>
       </w:r>
     </w:p>
     <w:p>
@@ -171,7 +269,7 @@
         <w:pStyle w:val="ListBullet"/>
       </w:pPr>
       <w:r>
-        <w:t>Corretor: Vamos confirmar `MED-0021` e os documentos relacionados.</w:t>
+        <w:t>Registrar a dúvida principal do cliente.</w:t>
       </w:r>
     </w:p>
     <w:p>
@@ -179,7 +277,7 @@
         <w:pStyle w:val="ListBullet"/>
       </w:pPr>
       <w:r>
-        <w:t>Cliente: Então esse item influencia a análise do benefício?</w:t>
+        <w:t>Separar explicação comercial de decisão formal da seguradora.</w:t>
       </w:r>
     </w:p>
     <w:p>
@@ -187,7 +285,15 @@
         <w:pStyle w:val="ListBullet"/>
       </w:pPr>
       <w:r>
-        <w:t>Corretor: Sim. Ele ajuda a seguradora a verificar o contrato e evitar atraso.</w:t>
+        <w:t>Apontar os verbetes e FAQs relacionados quando houver dúvida técnica.</w:t>
+      </w:r>
+    </w:p>
+    <w:p>
+      <w:pPr>
+        <w:pStyle w:val="Heading2"/>
+      </w:pPr>
+      <w:r>
+        <w:t>Termos relacionados</w:t>
       </w:r>
     </w:p>
     <w:p>
@@ -195,7 +301,7 @@
         <w:pStyle w:val="ListBullet"/>
       </w:pPr>
       <w:r>
-        <w:t>Corretor: Vamos confirmar `MED-0022` e os documentos relacionados.</w:t>
+        <w:t>MED-0021</w:t>
       </w:r>
     </w:p>
     <w:p>
@@ -203,7 +309,7 @@
         <w:pStyle w:val="ListBullet"/>
       </w:pPr>
       <w:r>
-        <w:t>Cliente: Então esse item influencia a análise do benefício?</w:t>
+        <w:t>MED-0022</w:t>
       </w:r>
     </w:p>
     <w:p>
@@ -211,7 +317,7 @@
         <w:pStyle w:val="ListBullet"/>
       </w:pPr>
       <w:r>
-        <w:t>Corretor: Sim. Ele ajuda a seguradora a verificar o contrato e evitar atraso.</w:t>
+        <w:t>MED-0023</w:t>
       </w:r>
     </w:p>
     <w:p>
@@ -219,7 +325,15 @@
         <w:pStyle w:val="ListBullet"/>
       </w:pPr>
       <w:r>
-        <w:t>Corretor: Vamos confirmar `MED-0023` e os documentos relacionados.</w:t>
+        <w:t>MED-0024</w:t>
+      </w:r>
+    </w:p>
+    <w:p>
+      <w:pPr>
+        <w:pStyle w:val="Heading2"/>
+      </w:pPr>
+      <w:r>
+        <w:t>FAQs relacionadas</w:t>
       </w:r>
     </w:p>
     <w:p>
@@ -227,7 +341,7 @@
         <w:pStyle w:val="ListBullet"/>
       </w:pPr>
       <w:r>
-        <w:t>Cliente: Então esse item influencia a análise do benefício?</w:t>
+        <w:t>FAQ-MED-0021</w:t>
       </w:r>
     </w:p>
     <w:p>
@@ -235,7 +349,7 @@
         <w:pStyle w:val="ListBullet"/>
       </w:pPr>
       <w:r>
-        <w:t>Corretor: Sim. Ele ajuda a seguradora a verificar o contrato e evitar atraso.</w:t>
+        <w:t>FAQ-MED-0022</w:t>
       </w:r>
     </w:p>
     <w:p>
@@ -243,7 +357,7 @@
         <w:pStyle w:val="ListBullet"/>
       </w:pPr>
       <w:r>
-        <w:t>Corretor: Vamos confirmar `MED-0024` e os documentos relacionados.</w:t>
+        <w:t>FAQ-MED-0023</w:t>
       </w:r>
     </w:p>
     <w:p>
@@ -251,7 +365,15 @@
         <w:pStyle w:val="ListBullet"/>
       </w:pPr>
       <w:r>
-        <w:t>Cliente: Então esse item influencia a análise do benefício?</w:t>
+        <w:t>FAQ-MED-0024</w:t>
+      </w:r>
+    </w:p>
+    <w:p>
+      <w:pPr>
+        <w:pStyle w:val="Heading2"/>
+      </w:pPr>
+      <w:r>
+        <w:t>Casos relacionados</w:t>
       </w:r>
     </w:p>
     <w:p>
@@ -259,7 +381,15 @@
         <w:pStyle w:val="ListBullet"/>
       </w:pPr>
       <w:r>
-        <w:t>Corretor: Sim. Ele ajuda a seguradora a verificar o contrato e evitar atraso.</w:t>
+        <w:t>CASE-MED-0009</w:t>
+      </w:r>
+    </w:p>
+    <w:p>
+      <w:pPr>
+        <w:pStyle w:val="Heading2"/>
+      </w:pPr>
+      <w:r>
+        <w:t>Referências cruzadas</w:t>
       </w:r>
     </w:p>
     <w:p>
@@ -267,7 +397,7 @@
         <w:pStyle w:val="ListBullet"/>
       </w:pPr>
       <w:r>
-        <w:t>Cliente: Se faltar alguma coisa, eu perco o direito?</w:t>
+        <w:t>MED-0021</w:t>
       </w:r>
     </w:p>
     <w:p>
@@ -275,7 +405,63 @@
         <w:pStyle w:val="ListBullet"/>
       </w:pPr>
       <w:r>
-        <w:t>Corretor: Normalmente a análise fica pendente até a correção, mas precisamos respeitar prazos e instruções da seguradora.</w:t>
+        <w:t>MED-0022</w:t>
+      </w:r>
+    </w:p>
+    <w:p>
+      <w:pPr>
+        <w:pStyle w:val="ListBullet"/>
+      </w:pPr>
+      <w:r>
+        <w:t>MED-0023</w:t>
+      </w:r>
+    </w:p>
+    <w:p>
+      <w:pPr>
+        <w:pStyle w:val="ListBullet"/>
+      </w:pPr>
+      <w:r>
+        <w:t>MED-0024</w:t>
+      </w:r>
+    </w:p>
+    <w:p>
+      <w:pPr>
+        <w:pStyle w:val="ListBullet"/>
+      </w:pPr>
+      <w:r>
+        <w:t>FAQ-MED-0021</w:t>
+      </w:r>
+    </w:p>
+    <w:p>
+      <w:pPr>
+        <w:pStyle w:val="ListBullet"/>
+      </w:pPr>
+      <w:r>
+        <w:t>FAQ-MED-0022</w:t>
+      </w:r>
+    </w:p>
+    <w:p>
+      <w:pPr>
+        <w:pStyle w:val="ListBullet"/>
+      </w:pPr>
+      <w:r>
+        <w:t>FAQ-MED-0023</w:t>
+      </w:r>
+    </w:p>
+    <w:p>
+      <w:pPr>
+        <w:pStyle w:val="ListBullet"/>
+      </w:pPr>
+      <w:r>
+        <w:t>FAQ-MED-0024</w:t>
+      </w:r>
+    </w:p>
+    <w:p>
+      <w:pPr>
+        <w:pStyle w:val="ListBullet"/>
+      </w:pPr>
+      <w:r>
+        <w:t>CASE-MED-0009</w:t>
       </w:r>
     </w:p>
     <w:p>
@@ -283,7 +469,7 @@
         <w:pStyle w:val="Heading2"/>
       </w:pPr>
       <w:r>
-        <w:t>Pontos de atenção para o corretor</w:t>
+        <w:t>Tags</w:t>
       </w:r>
     </w:p>
     <w:p>
@@ -291,7 +477,7 @@
         <w:pStyle w:val="ListBullet"/>
       </w:pPr>
       <w:r>
-        <w:t>Confirmar produto, apólice e data do evento médico.</w:t>
+        <w:t>dialogue</w:t>
       </w:r>
     </w:p>
     <w:p>
@@ -299,7 +485,7 @@
         <w:pStyle w:val="ListBullet"/>
       </w:pPr>
       <w:r>
-        <w:t>Não prometer pagamento antes da análise da seguradora.</w:t>
+        <w:t>med</w:t>
       </w:r>
     </w:p>
     <w:p>
@@ -307,7 +493,15 @@
         <w:pStyle w:val="ListBullet"/>
       </w:pPr>
       <w:r>
-        <w:t>Explicar documentos em português simples, sem tradução literal confusa.</w:t>
+        <w:t>atendimento-bilingue</w:t>
+      </w:r>
+    </w:p>
+    <w:p>
+      <w:pPr>
+        <w:pStyle w:val="ListBullet"/>
+      </w:pPr>
+      <w:r>
+        <w:t>notebooklm</w:t>
       </w:r>
     </w:p>
     <w:p>
@@ -315,7 +509,7 @@
         <w:pStyle w:val="Heading2"/>
       </w:pPr>
       <w:r>
-        <w:t>Termos relacionados</w:t>
+        <w:t>Veja também</w:t>
       </w:r>
     </w:p>
     <w:p>
@@ -323,207 +517,7 @@
         <w:pStyle w:val="ListBullet"/>
       </w:pPr>
       <w:r>
-        <w:t>MED-0021</w:t>
-      </w:r>
-    </w:p>
-    <w:p>
-      <w:pPr>
-        <w:pStyle w:val="ListBullet"/>
-      </w:pPr>
-      <w:r>
-        <w:t>MED-0022</w:t>
-      </w:r>
-    </w:p>
-    <w:p>
-      <w:pPr>
-        <w:pStyle w:val="ListBullet"/>
-      </w:pPr>
-      <w:r>
-        <w:t>MED-0023</w:t>
-      </w:r>
-    </w:p>
-    <w:p>
-      <w:pPr>
-        <w:pStyle w:val="ListBullet"/>
-      </w:pPr>
-      <w:r>
-        <w:t>MED-0024</w:t>
-      </w:r>
-    </w:p>
-    <w:p>
-      <w:pPr>
-        <w:pStyle w:val="Heading2"/>
-      </w:pPr>
-      <w:r>
-        <w:t>FAQs relacionadas</w:t>
-      </w:r>
-    </w:p>
-    <w:p>
-      <w:pPr>
-        <w:pStyle w:val="ListBullet"/>
-      </w:pPr>
-      <w:r>
-        <w:t>FAQ-MED-0021</w:t>
-      </w:r>
-    </w:p>
-    <w:p>
-      <w:pPr>
-        <w:pStyle w:val="ListBullet"/>
-      </w:pPr>
-      <w:r>
-        <w:t>FAQ-MED-0022</w:t>
-      </w:r>
-    </w:p>
-    <w:p>
-      <w:pPr>
-        <w:pStyle w:val="ListBullet"/>
-      </w:pPr>
-      <w:r>
-        <w:t>FAQ-MED-0023</w:t>
-      </w:r>
-    </w:p>
-    <w:p>
-      <w:pPr>
-        <w:pStyle w:val="ListBullet"/>
-      </w:pPr>
-      <w:r>
-        <w:t>FAQ-MED-0024</w:t>
-      </w:r>
-    </w:p>
-    <w:p>
-      <w:pPr>
-        <w:pStyle w:val="Heading2"/>
-      </w:pPr>
-      <w:r>
-        <w:t>Casos relacionados</w:t>
-      </w:r>
-    </w:p>
-    <w:p>
-      <w:pPr>
-        <w:pStyle w:val="ListBullet"/>
-      </w:pPr>
-      <w:r>
-        <w:t>CASE-MED-0009</w:t>
-      </w:r>
-    </w:p>
-    <w:p>
-      <w:pPr>
-        <w:pStyle w:val="Heading2"/>
-      </w:pPr>
-      <w:r>
-        <w:t>Referências cruzadas</w:t>
-      </w:r>
-    </w:p>
-    <w:p>
-      <w:pPr>
-        <w:pStyle w:val="ListBullet"/>
-      </w:pPr>
-      <w:r>
-        <w:t>MED-0021</w:t>
-      </w:r>
-    </w:p>
-    <w:p>
-      <w:pPr>
-        <w:pStyle w:val="ListBullet"/>
-      </w:pPr>
-      <w:r>
-        <w:t>MED-0022</w:t>
-      </w:r>
-    </w:p>
-    <w:p>
-      <w:pPr>
-        <w:pStyle w:val="ListBullet"/>
-      </w:pPr>
-      <w:r>
-        <w:t>MED-0023</w:t>
-      </w:r>
-    </w:p>
-    <w:p>
-      <w:pPr>
-        <w:pStyle w:val="ListBullet"/>
-      </w:pPr>
-      <w:r>
-        <w:t>MED-0024</w:t>
-      </w:r>
-    </w:p>
-    <w:p>
-      <w:pPr>
-        <w:pStyle w:val="ListBullet"/>
-      </w:pPr>
-      <w:r>
-        <w:t>FAQ-MED-0021</w:t>
-      </w:r>
-    </w:p>
-    <w:p>
-      <w:pPr>
-        <w:pStyle w:val="ListBullet"/>
-      </w:pPr>
-      <w:r>
-        <w:t>FAQ-MED-0022</w:t>
-      </w:r>
-    </w:p>
-    <w:p>
-      <w:pPr>
-        <w:pStyle w:val="ListBullet"/>
-      </w:pPr>
-      <w:r>
-        <w:t>FAQ-MED-0023</w:t>
-      </w:r>
-    </w:p>
-    <w:p>
-      <w:pPr>
-        <w:pStyle w:val="ListBullet"/>
-      </w:pPr>
-      <w:r>
-        <w:t>FAQ-MED-0024</w:t>
-      </w:r>
-    </w:p>
-    <w:p>
-      <w:pPr>
-        <w:pStyle w:val="ListBullet"/>
-      </w:pPr>
-      <w:r>
-        <w:t>CASE-MED-0009</w:t>
-      </w:r>
-    </w:p>
-    <w:p>
-      <w:pPr>
-        <w:pStyle w:val="Heading2"/>
-      </w:pPr>
-      <w:r>
-        <w:t>Tags</w:t>
-      </w:r>
-    </w:p>
-    <w:p>
-      <w:pPr>
-        <w:pStyle w:val="ListBullet"/>
-      </w:pPr>
-      <w:r>
-        <w:t>dialogue</w:t>
-      </w:r>
-    </w:p>
-    <w:p>
-      <w:pPr>
-        <w:pStyle w:val="ListBullet"/>
-      </w:pPr>
-      <w:r>
-        <w:t>med</w:t>
-      </w:r>
-    </w:p>
-    <w:p>
-      <w:pPr>
-        <w:pStyle w:val="ListBullet"/>
-      </w:pPr>
-      <w:r>
-        <w:t>solicitacao</w:t>
-      </w:r>
-    </w:p>
-    <w:p>
-      <w:pPr>
-        <w:pStyle w:val="ListBullet"/>
-      </w:pPr>
-      <w:r>
-        <w:t>atendimento</w:t>
+        <w:t>`15_CaseStudies/MED/CASE-MED-0009.md`</w:t>
       </w:r>
     </w:p>
     <w:p>
@@ -605,7 +599,7 @@
           </w:tcPr>
           <w:p>
             <w:r>
-              <w:t>0.1</w:t>
+              <w:t>0.2</w:t>
             </w:r>
           </w:p>
         </w:tc>
@@ -625,7 +619,7 @@
           </w:tcPr>
           <w:p>
             <w:r>
-              <w:t>Criação inicial.</w:t>
+              <w:t>Normalização bilíngue com versão japonesa e portuguesa.</w:t>
             </w:r>
           </w:p>
         </w:tc>
@@ -642,7 +636,7 @@
         <w:pStyle w:val="Heading1"/>
       </w:pPr>
       <w:r>
-        <w:t>DIALOGUE-MED-0007 - Comprovantes de internação, cirurgia e alta</w:t>
+        <w:t>DIALOGUE-MED-0007 - Comprovantes de internação, cirurgia, alta e tratamento ambulatorial</w:t>
       </w:r>
     </w:p>
     <w:p>
@@ -658,7 +652,7 @@
         <w:pStyle w:val="ListBullet"/>
       </w:pPr>
       <w:r>
-        <w:t>Versão: 0.1</w:t>
+        <w:t>Versão: 0.2</w:t>
       </w:r>
     </w:p>
     <w:p>
@@ -682,7 +676,7 @@
         <w:pStyle w:val="ListBullet"/>
       </w:pPr>
       <w:r>
-        <w:t>Histórico: Criação inicial.</w:t>
+        <w:t>Histórico: Normalização bilíngue para uso por corretor japonês no NotebookLM.</w:t>
       </w:r>
     </w:p>
     <w:p>
@@ -721,7 +715,7 @@
     </w:p>
     <w:p>
       <w:r>
-        <w:t>Cliente terminou internação e precisa organizar comprovantes.</w:t>
+        <w:t>Cliente terminou atendimento hospitalar e precisa comprovar internação, cirurgia ou tratamento ambulatorial.</w:t>
       </w:r>
     </w:p>
     <w:p>
@@ -729,12 +723,36 @@
         <w:pStyle w:val="Heading2"/>
       </w:pPr>
       <w:r>
+        <w:t>Participantes</w:t>
+      </w:r>
+    </w:p>
+    <w:p>
+      <w:pPr>
+        <w:pStyle w:val="ListBullet"/>
+      </w:pPr>
+      <w:r>
+        <w:t>Corretor: corretor japonês</w:t>
+      </w:r>
+    </w:p>
+    <w:p>
+      <w:pPr>
+        <w:pStyle w:val="ListBullet"/>
+      </w:pPr>
+      <w:r>
+        <w:t>Cliente: cliente brasileiro residente no Japão</w:t>
+      </w:r>
+    </w:p>
+    <w:p>
+      <w:pPr>
+        <w:pStyle w:val="Heading2"/>
+      </w:pPr>
+      <w:r>
         <w:t>Objetivo do diálogo</w:t>
       </w:r>
     </w:p>
     <w:p>
       <w:r>
-        <w:t>Explicar em português simples o fluxo de documentos e análise, preservando a precisão do termo japonês.</w:t>
+        <w:t>Orientar quais comprovantes confirmam datas, tipo de atendimento e base de cálculo do benefício.</w:t>
       </w:r>
     </w:p>
     <w:p>
@@ -742,7 +760,73 @@
         <w:pStyle w:val="Heading2"/>
       </w:pPr>
       <w:r>
-        <w:t>Diálogo</w:t>
+        <w:t>Versão em japonês</w:t>
+      </w:r>
+    </w:p>
+    <w:p>
+      <w:r>
+        <w:t>**Corretor:** 入院日、退院日、手術日を正確に確認します。</w:t>
+      </w:r>
+    </w:p>
+    <w:p>
+      <w:r>
+        <w:t>**Cliente:** それはポルトガル語でお客様にどう説明すればよいですか。</w:t>
+      </w:r>
+    </w:p>
+    <w:p>
+      <w:r>
+        <w:t>**Corretor:** 手術証明書があると、手術給付金の査定がしやすくなります。</w:t>
+      </w:r>
+    </w:p>
+    <w:p>
+      <w:r>
+        <w:t>**Cliente:** 支払いを約束してもよいですか。</w:t>
+      </w:r>
+    </w:p>
+    <w:p>
+      <w:r>
+        <w:t>**Corretor:** 通院保障がある場合は、通院日も証明する必要があります。</w:t>
+      </w:r>
+    </w:p>
+    <w:p>
+      <w:pPr>
+        <w:pStyle w:val="Heading2"/>
+      </w:pPr>
+      <w:r>
+        <w:t>Versão em português brasileiro</w:t>
+      </w:r>
+    </w:p>
+    <w:p>
+      <w:r>
+        <w:t>**Corretor:** Precisamos confirmar a data de internação, alta e cirurgia.</w:t>
+      </w:r>
+    </w:p>
+    <w:p>
+      <w:r>
+        <w:t>**Cliente:** Então isso já garante o pagamento?</w:t>
+      </w:r>
+    </w:p>
+    <w:p>
+      <w:r>
+        <w:t>**Corretor:** O comprovante de cirurgia ajuda a seguradora a analisar o benefício.</w:t>
+      </w:r>
+    </w:p>
+    <w:p>
+      <w:r>
+        <w:t>**Cliente:** O que eu preciso fazer agora?</w:t>
+      </w:r>
+    </w:p>
+    <w:p>
+      <w:r>
+        <w:t>**Corretor:** Se houver cobertura ambulatorial, também precisamos comprovar as datas de tratamento.</w:t>
+      </w:r>
+    </w:p>
+    <w:p>
+      <w:pPr>
+        <w:pStyle w:val="Heading2"/>
+      </w:pPr>
+      <w:r>
+        <w:t>Notas culturais ou comerciais</w:t>
       </w:r>
     </w:p>
     <w:p>
@@ -750,7 +834,7 @@
         <w:pStyle w:val="ListBullet"/>
       </w:pPr>
       <w:r>
-        <w:t>Corretor: Vamos organizar a solicitação por etapas.</w:t>
+        <w:t>Confirmar documentos e condições antes de orientar o cliente.</w:t>
       </w:r>
     </w:p>
     <w:p>
@@ -758,7 +842,7 @@
         <w:pStyle w:val="ListBullet"/>
       </w:pPr>
       <w:r>
-        <w:t>Cliente: Eu preciso entregar todos os documentos agora?</w:t>
+        <w:t>Não prometer aceitação, cobertura ou pagamento antes da análise da seguradora.</w:t>
       </w:r>
     </w:p>
     <w:p>
@@ -766,7 +850,15 @@
         <w:pStyle w:val="ListBullet"/>
       </w:pPr>
       <w:r>
-        <w:t>Corretor: Primeiro confirmamos o tipo de benefício e depois a lista exigida pela seguradora.</w:t>
+        <w:t>Usar português simples e evitar tradução literal quando prejudicar a compreensão.</w:t>
+      </w:r>
+    </w:p>
+    <w:p>
+      <w:pPr>
+        <w:pStyle w:val="Heading2"/>
+      </w:pPr>
+      <w:r>
+        <w:t>Pontos de atenção para o corretor</w:t>
       </w:r>
     </w:p>
     <w:p>
@@ -774,7 +866,7 @@
         <w:pStyle w:val="ListBullet"/>
       </w:pPr>
       <w:r>
-        <w:t>Corretor: Vamos confirmar `MED-0025` e os documentos relacionados.</w:t>
+        <w:t>Registrar a dúvida principal do cliente.</w:t>
       </w:r>
     </w:p>
     <w:p>
@@ -782,7 +874,7 @@
         <w:pStyle w:val="ListBullet"/>
       </w:pPr>
       <w:r>
-        <w:t>Cliente: Então esse item influencia a análise do benefício?</w:t>
+        <w:t>Separar explicação comercial de decisão formal da seguradora.</w:t>
       </w:r>
     </w:p>
     <w:p>
@@ -790,7 +882,15 @@
         <w:pStyle w:val="ListBullet"/>
       </w:pPr>
       <w:r>
-        <w:t>Corretor: Sim. Ele ajuda a seguradora a verificar o contrato e evitar atraso.</w:t>
+        <w:t>Apontar os verbetes e FAQs relacionados quando houver dúvida técnica.</w:t>
+      </w:r>
+    </w:p>
+    <w:p>
+      <w:pPr>
+        <w:pStyle w:val="Heading2"/>
+      </w:pPr>
+      <w:r>
+        <w:t>Termos relacionados</w:t>
       </w:r>
     </w:p>
     <w:p>
@@ -798,7 +898,7 @@
         <w:pStyle w:val="ListBullet"/>
       </w:pPr>
       <w:r>
-        <w:t>Corretor: Vamos confirmar `MED-0026` e os documentos relacionados.</w:t>
+        <w:t>MED-0025</w:t>
       </w:r>
     </w:p>
     <w:p>
@@ -806,7 +906,7 @@
         <w:pStyle w:val="ListBullet"/>
       </w:pPr>
       <w:r>
-        <w:t>Cliente: Então esse item influencia a análise do benefício?</w:t>
+        <w:t>MED-0026</w:t>
       </w:r>
     </w:p>
     <w:p>
@@ -814,7 +914,7 @@
         <w:pStyle w:val="ListBullet"/>
       </w:pPr>
       <w:r>
-        <w:t>Corretor: Sim. Ele ajuda a seguradora a verificar o contrato e evitar atraso.</w:t>
+        <w:t>MED-0027</w:t>
       </w:r>
     </w:p>
     <w:p>
@@ -822,7 +922,15 @@
         <w:pStyle w:val="ListBullet"/>
       </w:pPr>
       <w:r>
-        <w:t>Corretor: Vamos confirmar `MED-0027` e os documentos relacionados.</w:t>
+        <w:t>MED-0028</w:t>
+      </w:r>
+    </w:p>
+    <w:p>
+      <w:pPr>
+        <w:pStyle w:val="Heading2"/>
+      </w:pPr>
+      <w:r>
+        <w:t>FAQs relacionadas</w:t>
       </w:r>
     </w:p>
     <w:p>
@@ -830,7 +938,7 @@
         <w:pStyle w:val="ListBullet"/>
       </w:pPr>
       <w:r>
-        <w:t>Cliente: Então esse item influencia a análise do benefício?</w:t>
+        <w:t>FAQ-MED-0025</w:t>
       </w:r>
     </w:p>
     <w:p>
@@ -838,7 +946,7 @@
         <w:pStyle w:val="ListBullet"/>
       </w:pPr>
       <w:r>
-        <w:t>Corretor: Sim. Ele ajuda a seguradora a verificar o contrato e evitar atraso.</w:t>
+        <w:t>FAQ-MED-0026</w:t>
       </w:r>
     </w:p>
     <w:p>
@@ -846,7 +954,7 @@
         <w:pStyle w:val="ListBullet"/>
       </w:pPr>
       <w:r>
-        <w:t>Corretor: Vamos confirmar `MED-0028` e os documentos relacionados.</w:t>
+        <w:t>FAQ-MED-0027</w:t>
       </w:r>
     </w:p>
     <w:p>
@@ -854,7 +962,15 @@
         <w:pStyle w:val="ListBullet"/>
       </w:pPr>
       <w:r>
-        <w:t>Cliente: Então esse item influencia a análise do benefício?</w:t>
+        <w:t>FAQ-MED-0028</w:t>
+      </w:r>
+    </w:p>
+    <w:p>
+      <w:pPr>
+        <w:pStyle w:val="Heading2"/>
+      </w:pPr>
+      <w:r>
+        <w:t>Casos relacionados</w:t>
       </w:r>
     </w:p>
     <w:p>
@@ -862,7 +978,15 @@
         <w:pStyle w:val="ListBullet"/>
       </w:pPr>
       <w:r>
-        <w:t>Corretor: Sim. Ele ajuda a seguradora a verificar o contrato e evitar atraso.</w:t>
+        <w:t>CASE-MED-0012</w:t>
+      </w:r>
+    </w:p>
+    <w:p>
+      <w:pPr>
+        <w:pStyle w:val="Heading2"/>
+      </w:pPr>
+      <w:r>
+        <w:t>Referências cruzadas</w:t>
       </w:r>
     </w:p>
     <w:p>
@@ -870,7 +994,7 @@
         <w:pStyle w:val="ListBullet"/>
       </w:pPr>
       <w:r>
-        <w:t>Cliente: Se faltar alguma coisa, eu perco o direito?</w:t>
+        <w:t>MED-0025</w:t>
       </w:r>
     </w:p>
     <w:p>
@@ -878,7 +1002,63 @@
         <w:pStyle w:val="ListBullet"/>
       </w:pPr>
       <w:r>
-        <w:t>Corretor: Normalmente a análise fica pendente até a correção, mas precisamos respeitar prazos e instruções da seguradora.</w:t>
+        <w:t>MED-0026</w:t>
+      </w:r>
+    </w:p>
+    <w:p>
+      <w:pPr>
+        <w:pStyle w:val="ListBullet"/>
+      </w:pPr>
+      <w:r>
+        <w:t>MED-0027</w:t>
+      </w:r>
+    </w:p>
+    <w:p>
+      <w:pPr>
+        <w:pStyle w:val="ListBullet"/>
+      </w:pPr>
+      <w:r>
+        <w:t>MED-0028</w:t>
+      </w:r>
+    </w:p>
+    <w:p>
+      <w:pPr>
+        <w:pStyle w:val="ListBullet"/>
+      </w:pPr>
+      <w:r>
+        <w:t>FAQ-MED-0025</w:t>
+      </w:r>
+    </w:p>
+    <w:p>
+      <w:pPr>
+        <w:pStyle w:val="ListBullet"/>
+      </w:pPr>
+      <w:r>
+        <w:t>FAQ-MED-0026</w:t>
+      </w:r>
+    </w:p>
+    <w:p>
+      <w:pPr>
+        <w:pStyle w:val="ListBullet"/>
+      </w:pPr>
+      <w:r>
+        <w:t>FAQ-MED-0027</w:t>
+      </w:r>
+    </w:p>
+    <w:p>
+      <w:pPr>
+        <w:pStyle w:val="ListBullet"/>
+      </w:pPr>
+      <w:r>
+        <w:t>FAQ-MED-0028</w:t>
+      </w:r>
+    </w:p>
+    <w:p>
+      <w:pPr>
+        <w:pStyle w:val="ListBullet"/>
+      </w:pPr>
+      <w:r>
+        <w:t>CASE-MED-0012</w:t>
       </w:r>
     </w:p>
     <w:p>
@@ -886,7 +1066,7 @@
         <w:pStyle w:val="Heading2"/>
       </w:pPr>
       <w:r>
-        <w:t>Pontos de atenção para o corretor</w:t>
+        <w:t>Tags</w:t>
       </w:r>
     </w:p>
     <w:p>
@@ -894,7 +1074,7 @@
         <w:pStyle w:val="ListBullet"/>
       </w:pPr>
       <w:r>
-        <w:t>Confirmar produto, apólice e data do evento médico.</w:t>
+        <w:t>dialogue</w:t>
       </w:r>
     </w:p>
     <w:p>
@@ -902,7 +1082,7 @@
         <w:pStyle w:val="ListBullet"/>
       </w:pPr>
       <w:r>
-        <w:t>Não prometer pagamento antes da análise da seguradora.</w:t>
+        <w:t>med</w:t>
       </w:r>
     </w:p>
     <w:p>
@@ -910,7 +1090,15 @@
         <w:pStyle w:val="ListBullet"/>
       </w:pPr>
       <w:r>
-        <w:t>Explicar documentos em português simples, sem tradução literal confusa.</w:t>
+        <w:t>atendimento-bilingue</w:t>
+      </w:r>
+    </w:p>
+    <w:p>
+      <w:pPr>
+        <w:pStyle w:val="ListBullet"/>
+      </w:pPr>
+      <w:r>
+        <w:t>notebooklm</w:t>
       </w:r>
     </w:p>
     <w:p>
@@ -918,7 +1106,7 @@
         <w:pStyle w:val="Heading2"/>
       </w:pPr>
       <w:r>
-        <w:t>Termos relacionados</w:t>
+        <w:t>Veja também</w:t>
       </w:r>
     </w:p>
     <w:p>
@@ -926,207 +1114,7 @@
         <w:pStyle w:val="ListBullet"/>
       </w:pPr>
       <w:r>
-        <w:t>MED-0025</w:t>
-      </w:r>
-    </w:p>
-    <w:p>
-      <w:pPr>
-        <w:pStyle w:val="ListBullet"/>
-      </w:pPr>
-      <w:r>
-        <w:t>MED-0026</w:t>
-      </w:r>
-    </w:p>
-    <w:p>
-      <w:pPr>
-        <w:pStyle w:val="ListBullet"/>
-      </w:pPr>
-      <w:r>
-        <w:t>MED-0027</w:t>
-      </w:r>
-    </w:p>
-    <w:p>
-      <w:pPr>
-        <w:pStyle w:val="ListBullet"/>
-      </w:pPr>
-      <w:r>
-        <w:t>MED-0028</w:t>
-      </w:r>
-    </w:p>
-    <w:p>
-      <w:pPr>
-        <w:pStyle w:val="Heading2"/>
-      </w:pPr>
-      <w:r>
-        <w:t>FAQs relacionadas</w:t>
-      </w:r>
-    </w:p>
-    <w:p>
-      <w:pPr>
-        <w:pStyle w:val="ListBullet"/>
-      </w:pPr>
-      <w:r>
-        <w:t>FAQ-MED-0025</w:t>
-      </w:r>
-    </w:p>
-    <w:p>
-      <w:pPr>
-        <w:pStyle w:val="ListBullet"/>
-      </w:pPr>
-      <w:r>
-        <w:t>FAQ-MED-0026</w:t>
-      </w:r>
-    </w:p>
-    <w:p>
-      <w:pPr>
-        <w:pStyle w:val="ListBullet"/>
-      </w:pPr>
-      <w:r>
-        <w:t>FAQ-MED-0027</w:t>
-      </w:r>
-    </w:p>
-    <w:p>
-      <w:pPr>
-        <w:pStyle w:val="ListBullet"/>
-      </w:pPr>
-      <w:r>
-        <w:t>FAQ-MED-0028</w:t>
-      </w:r>
-    </w:p>
-    <w:p>
-      <w:pPr>
-        <w:pStyle w:val="Heading2"/>
-      </w:pPr>
-      <w:r>
-        <w:t>Casos relacionados</w:t>
-      </w:r>
-    </w:p>
-    <w:p>
-      <w:pPr>
-        <w:pStyle w:val="ListBullet"/>
-      </w:pPr>
-      <w:r>
-        <w:t>CASE-MED-0011</w:t>
-      </w:r>
-    </w:p>
-    <w:p>
-      <w:pPr>
-        <w:pStyle w:val="Heading2"/>
-      </w:pPr>
-      <w:r>
-        <w:t>Referências cruzadas</w:t>
-      </w:r>
-    </w:p>
-    <w:p>
-      <w:pPr>
-        <w:pStyle w:val="ListBullet"/>
-      </w:pPr>
-      <w:r>
-        <w:t>MED-0025</w:t>
-      </w:r>
-    </w:p>
-    <w:p>
-      <w:pPr>
-        <w:pStyle w:val="ListBullet"/>
-      </w:pPr>
-      <w:r>
-        <w:t>MED-0026</w:t>
-      </w:r>
-    </w:p>
-    <w:p>
-      <w:pPr>
-        <w:pStyle w:val="ListBullet"/>
-      </w:pPr>
-      <w:r>
-        <w:t>MED-0027</w:t>
-      </w:r>
-    </w:p>
-    <w:p>
-      <w:pPr>
-        <w:pStyle w:val="ListBullet"/>
-      </w:pPr>
-      <w:r>
-        <w:t>MED-0028</w:t>
-      </w:r>
-    </w:p>
-    <w:p>
-      <w:pPr>
-        <w:pStyle w:val="ListBullet"/>
-      </w:pPr>
-      <w:r>
-        <w:t>FAQ-MED-0025</w:t>
-      </w:r>
-    </w:p>
-    <w:p>
-      <w:pPr>
-        <w:pStyle w:val="ListBullet"/>
-      </w:pPr>
-      <w:r>
-        <w:t>FAQ-MED-0026</w:t>
-      </w:r>
-    </w:p>
-    <w:p>
-      <w:pPr>
-        <w:pStyle w:val="ListBullet"/>
-      </w:pPr>
-      <w:r>
-        <w:t>FAQ-MED-0027</w:t>
-      </w:r>
-    </w:p>
-    <w:p>
-      <w:pPr>
-        <w:pStyle w:val="ListBullet"/>
-      </w:pPr>
-      <w:r>
-        <w:t>FAQ-MED-0028</w:t>
-      </w:r>
-    </w:p>
-    <w:p>
-      <w:pPr>
-        <w:pStyle w:val="ListBullet"/>
-      </w:pPr>
-      <w:r>
-        <w:t>CASE-MED-0011</w:t>
-      </w:r>
-    </w:p>
-    <w:p>
-      <w:pPr>
-        <w:pStyle w:val="Heading2"/>
-      </w:pPr>
-      <w:r>
-        <w:t>Tags</w:t>
-      </w:r>
-    </w:p>
-    <w:p>
-      <w:pPr>
-        <w:pStyle w:val="ListBullet"/>
-      </w:pPr>
-      <w:r>
-        <w:t>dialogue</w:t>
-      </w:r>
-    </w:p>
-    <w:p>
-      <w:pPr>
-        <w:pStyle w:val="ListBullet"/>
-      </w:pPr>
-      <w:r>
-        <w:t>med</w:t>
-      </w:r>
-    </w:p>
-    <w:p>
-      <w:pPr>
-        <w:pStyle w:val="ListBullet"/>
-      </w:pPr>
-      <w:r>
-        <w:t>solicitacao</w:t>
-      </w:r>
-    </w:p>
-    <w:p>
-      <w:pPr>
-        <w:pStyle w:val="ListBullet"/>
-      </w:pPr>
-      <w:r>
-        <w:t>atendimento</w:t>
+        <w:t>`15_CaseStudies/MED/CASE-MED-0012.md`</w:t>
       </w:r>
     </w:p>
     <w:p>
@@ -1208,7 +1196,7 @@
           </w:tcPr>
           <w:p>
             <w:r>
-              <w:t>0.1</w:t>
+              <w:t>0.2</w:t>
             </w:r>
           </w:p>
         </w:tc>
@@ -1228,7 +1216,7 @@
           </w:tcPr>
           <w:p>
             <w:r>
-              <w:t>Criação inicial.</w:t>
+              <w:t>Normalização bilíngue com versão japonesa e portuguesa.</w:t>
             </w:r>
           </w:p>
         </w:tc>
@@ -1245,7 +1233,7 @@
         <w:pStyle w:val="Heading1"/>
       </w:pPr>
       <w:r>
-        <w:t>DIALOGUE-MED-0008 - Prazo, documentos necessários e identificação</w:t>
+        <w:t>DIALOGUE-MED-0008 - Prazo, documentos necessários, identificação e dados bancários</w:t>
       </w:r>
     </w:p>
     <w:p>
@@ -1261,7 +1249,7 @@
         <w:pStyle w:val="ListBullet"/>
       </w:pPr>
       <w:r>
-        <w:t>Versão: 0.1</w:t>
+        <w:t>Versão: 0.2</w:t>
       </w:r>
     </w:p>
     <w:p>
@@ -1285,7 +1273,7 @@
         <w:pStyle w:val="ListBullet"/>
       </w:pPr>
       <w:r>
-        <w:t>Histórico: Criação inicial.</w:t>
+        <w:t>Histórico: Normalização bilíngue para uso por corretor japonês no NotebookLM.</w:t>
       </w:r>
     </w:p>
     <w:p>
@@ -1324,7 +1312,7 @@
     </w:p>
     <w:p>
       <w:r>
-        <w:t>Cliente quer evitar atraso por falta de documento.</w:t>
+        <w:t>Cliente quer evitar atraso no pedido de benefício médico.</w:t>
       </w:r>
     </w:p>
     <w:p>
@@ -1332,12 +1320,36 @@
         <w:pStyle w:val="Heading2"/>
       </w:pPr>
       <w:r>
+        <w:t>Participantes</w:t>
+      </w:r>
+    </w:p>
+    <w:p>
+      <w:pPr>
+        <w:pStyle w:val="ListBullet"/>
+      </w:pPr>
+      <w:r>
+        <w:t>Corretor: corretor japonês</w:t>
+      </w:r>
+    </w:p>
+    <w:p>
+      <w:pPr>
+        <w:pStyle w:val="ListBullet"/>
+      </w:pPr>
+      <w:r>
+        <w:t>Cliente: cliente brasileiro residente no Japão</w:t>
+      </w:r>
+    </w:p>
+    <w:p>
+      <w:pPr>
+        <w:pStyle w:val="Heading2"/>
+      </w:pPr>
+      <w:r>
         <w:t>Objetivo do diálogo</w:t>
       </w:r>
     </w:p>
     <w:p>
       <w:r>
-        <w:t>Explicar em português simples o fluxo de documentos e análise, preservando a precisão do termo japonês.</w:t>
+        <w:t>Explicar prazo, documentos necessários, identificação e dados bancários antes do envio.</w:t>
       </w:r>
     </w:p>
     <w:p>
@@ -1345,7 +1357,73 @@
         <w:pStyle w:val="Heading2"/>
       </w:pPr>
       <w:r>
-        <w:t>Diálogo</w:t>
+        <w:t>Versão em japonês</w:t>
+      </w:r>
+    </w:p>
+    <w:p>
+      <w:r>
+        <w:t>**Corretor:** 請求期限を過ぎないように早めに準備しましょう。</w:t>
+      </w:r>
+    </w:p>
+    <w:p>
+      <w:r>
+        <w:t>**Cliente:** それはポルトガル語でお客様にどう説明すればよいですか。</w:t>
+      </w:r>
+    </w:p>
+    <w:p>
+      <w:r>
+        <w:t>**Corretor:** 本人確認書類と口座情報は、支払い手続きに必要です。</w:t>
+      </w:r>
+    </w:p>
+    <w:p>
+      <w:r>
+        <w:t>**Cliente:** 支払いを約束してもよいですか。</w:t>
+      </w:r>
+    </w:p>
+    <w:p>
+      <w:r>
+        <w:t>**Corretor:** 口座情報に誤りがあると、入金が遅れることがあります。</w:t>
+      </w:r>
+    </w:p>
+    <w:p>
+      <w:pPr>
+        <w:pStyle w:val="Heading2"/>
+      </w:pPr>
+      <w:r>
+        <w:t>Versão em português brasileiro</w:t>
+      </w:r>
+    </w:p>
+    <w:p>
+      <w:r>
+        <w:t>**Corretor:** Vamos preparar tudo com antecedência para não perder prazo.</w:t>
+      </w:r>
+    </w:p>
+    <w:p>
+      <w:r>
+        <w:t>**Cliente:** Então isso já garante o pagamento?</w:t>
+      </w:r>
+    </w:p>
+    <w:p>
+      <w:r>
+        <w:t>**Corretor:** Documento de identificação e dados bancários são necessários para o pagamento.</w:t>
+      </w:r>
+    </w:p>
+    <w:p>
+      <w:r>
+        <w:t>**Cliente:** O que eu preciso fazer agora?</w:t>
+      </w:r>
+    </w:p>
+    <w:p>
+      <w:r>
+        <w:t>**Corretor:** Se a conta estiver errada, o depósito pode atrasar ou voltar.</w:t>
+      </w:r>
+    </w:p>
+    <w:p>
+      <w:pPr>
+        <w:pStyle w:val="Heading2"/>
+      </w:pPr>
+      <w:r>
+        <w:t>Notas culturais ou comerciais</w:t>
       </w:r>
     </w:p>
     <w:p>
@@ -1353,7 +1431,7 @@
         <w:pStyle w:val="ListBullet"/>
       </w:pPr>
       <w:r>
-        <w:t>Corretor: Vamos organizar a solicitação por etapas.</w:t>
+        <w:t>Confirmar documentos e condições antes de orientar o cliente.</w:t>
       </w:r>
     </w:p>
     <w:p>
@@ -1361,7 +1439,7 @@
         <w:pStyle w:val="ListBullet"/>
       </w:pPr>
       <w:r>
-        <w:t>Cliente: Eu preciso entregar todos os documentos agora?</w:t>
+        <w:t>Não prometer aceitação, cobertura ou pagamento antes da análise da seguradora.</w:t>
       </w:r>
     </w:p>
     <w:p>
@@ -1369,7 +1447,15 @@
         <w:pStyle w:val="ListBullet"/>
       </w:pPr>
       <w:r>
-        <w:t>Corretor: Primeiro confirmamos o tipo de benefício e depois a lista exigida pela seguradora.</w:t>
+        <w:t>Usar português simples e evitar tradução literal quando prejudicar a compreensão.</w:t>
+      </w:r>
+    </w:p>
+    <w:p>
+      <w:pPr>
+        <w:pStyle w:val="Heading2"/>
+      </w:pPr>
+      <w:r>
+        <w:t>Pontos de atenção para o corretor</w:t>
       </w:r>
     </w:p>
     <w:p>
@@ -1377,7 +1463,7 @@
         <w:pStyle w:val="ListBullet"/>
       </w:pPr>
       <w:r>
-        <w:t>Corretor: Vamos confirmar `MED-0029` e os documentos relacionados.</w:t>
+        <w:t>Registrar a dúvida principal do cliente.</w:t>
       </w:r>
     </w:p>
     <w:p>
@@ -1385,7 +1471,7 @@
         <w:pStyle w:val="ListBullet"/>
       </w:pPr>
       <w:r>
-        <w:t>Cliente: Então esse item influencia a análise do benefício?</w:t>
+        <w:t>Separar explicação comercial de decisão formal da seguradora.</w:t>
       </w:r>
     </w:p>
     <w:p>
@@ -1393,7 +1479,15 @@
         <w:pStyle w:val="ListBullet"/>
       </w:pPr>
       <w:r>
-        <w:t>Corretor: Sim. Ele ajuda a seguradora a verificar o contrato e evitar atraso.</w:t>
+        <w:t>Apontar os verbetes e FAQs relacionados quando houver dúvida técnica.</w:t>
+      </w:r>
+    </w:p>
+    <w:p>
+      <w:pPr>
+        <w:pStyle w:val="Heading2"/>
+      </w:pPr>
+      <w:r>
+        <w:t>Termos relacionados</w:t>
       </w:r>
     </w:p>
     <w:p>
@@ -1401,7 +1495,7 @@
         <w:pStyle w:val="ListBullet"/>
       </w:pPr>
       <w:r>
-        <w:t>Corretor: Vamos confirmar `MED-0030` e os documentos relacionados.</w:t>
+        <w:t>MED-0029</w:t>
       </w:r>
     </w:p>
     <w:p>
@@ -1409,7 +1503,7 @@
         <w:pStyle w:val="ListBullet"/>
       </w:pPr>
       <w:r>
-        <w:t>Cliente: Então esse item influencia a análise do benefício?</w:t>
+        <w:t>MED-0030</w:t>
       </w:r>
     </w:p>
     <w:p>
@@ -1417,7 +1511,7 @@
         <w:pStyle w:val="ListBullet"/>
       </w:pPr>
       <w:r>
-        <w:t>Corretor: Sim. Ele ajuda a seguradora a verificar o contrato e evitar atraso.</w:t>
+        <w:t>MED-0031</w:t>
       </w:r>
     </w:p>
     <w:p>
@@ -1425,7 +1519,15 @@
         <w:pStyle w:val="ListBullet"/>
       </w:pPr>
       <w:r>
-        <w:t>Corretor: Vamos confirmar `MED-0031` e os documentos relacionados.</w:t>
+        <w:t>MED-0032</w:t>
+      </w:r>
+    </w:p>
+    <w:p>
+      <w:pPr>
+        <w:pStyle w:val="Heading2"/>
+      </w:pPr>
+      <w:r>
+        <w:t>FAQs relacionadas</w:t>
       </w:r>
     </w:p>
     <w:p>
@@ -1433,7 +1535,7 @@
         <w:pStyle w:val="ListBullet"/>
       </w:pPr>
       <w:r>
-        <w:t>Cliente: Então esse item influencia a análise do benefício?</w:t>
+        <w:t>FAQ-MED-0029</w:t>
       </w:r>
     </w:p>
     <w:p>
@@ -1441,7 +1543,7 @@
         <w:pStyle w:val="ListBullet"/>
       </w:pPr>
       <w:r>
-        <w:t>Corretor: Sim. Ele ajuda a seguradora a verificar o contrato e evitar atraso.</w:t>
+        <w:t>FAQ-MED-0030</w:t>
       </w:r>
     </w:p>
     <w:p>
@@ -1449,7 +1551,7 @@
         <w:pStyle w:val="ListBullet"/>
       </w:pPr>
       <w:r>
-        <w:t>Corretor: Vamos confirmar `MED-0032` e os documentos relacionados.</w:t>
+        <w:t>FAQ-MED-0031</w:t>
       </w:r>
     </w:p>
     <w:p>
@@ -1457,7 +1559,15 @@
         <w:pStyle w:val="ListBullet"/>
       </w:pPr>
       <w:r>
-        <w:t>Cliente: Então esse item influencia a análise do benefício?</w:t>
+        <w:t>FAQ-MED-0032</w:t>
+      </w:r>
+    </w:p>
+    <w:p>
+      <w:pPr>
+        <w:pStyle w:val="Heading2"/>
+      </w:pPr>
+      <w:r>
+        <w:t>Casos relacionados</w:t>
       </w:r>
     </w:p>
     <w:p>
@@ -1465,7 +1575,15 @@
         <w:pStyle w:val="ListBullet"/>
       </w:pPr>
       <w:r>
-        <w:t>Corretor: Sim. Ele ajuda a seguradora a verificar o contrato e evitar atraso.</w:t>
+        <w:t>CASE-MED-0013</w:t>
+      </w:r>
+    </w:p>
+    <w:p>
+      <w:pPr>
+        <w:pStyle w:val="Heading2"/>
+      </w:pPr>
+      <w:r>
+        <w:t>Referências cruzadas</w:t>
       </w:r>
     </w:p>
     <w:p>
@@ -1473,7 +1591,7 @@
         <w:pStyle w:val="ListBullet"/>
       </w:pPr>
       <w:r>
-        <w:t>Cliente: Se faltar alguma coisa, eu perco o direito?</w:t>
+        <w:t>MED-0029</w:t>
       </w:r>
     </w:p>
     <w:p>
@@ -1481,7 +1599,63 @@
         <w:pStyle w:val="ListBullet"/>
       </w:pPr>
       <w:r>
-        <w:t>Corretor: Normalmente a análise fica pendente até a correção, mas precisamos respeitar prazos e instruções da seguradora.</w:t>
+        <w:t>MED-0030</w:t>
+      </w:r>
+    </w:p>
+    <w:p>
+      <w:pPr>
+        <w:pStyle w:val="ListBullet"/>
+      </w:pPr>
+      <w:r>
+        <w:t>MED-0031</w:t>
+      </w:r>
+    </w:p>
+    <w:p>
+      <w:pPr>
+        <w:pStyle w:val="ListBullet"/>
+      </w:pPr>
+      <w:r>
+        <w:t>MED-0032</w:t>
+      </w:r>
+    </w:p>
+    <w:p>
+      <w:pPr>
+        <w:pStyle w:val="ListBullet"/>
+      </w:pPr>
+      <w:r>
+        <w:t>FAQ-MED-0029</w:t>
+      </w:r>
+    </w:p>
+    <w:p>
+      <w:pPr>
+        <w:pStyle w:val="ListBullet"/>
+      </w:pPr>
+      <w:r>
+        <w:t>FAQ-MED-0030</w:t>
+      </w:r>
+    </w:p>
+    <w:p>
+      <w:pPr>
+        <w:pStyle w:val="ListBullet"/>
+      </w:pPr>
+      <w:r>
+        <w:t>FAQ-MED-0031</w:t>
+      </w:r>
+    </w:p>
+    <w:p>
+      <w:pPr>
+        <w:pStyle w:val="ListBullet"/>
+      </w:pPr>
+      <w:r>
+        <w:t>FAQ-MED-0032</w:t>
+      </w:r>
+    </w:p>
+    <w:p>
+      <w:pPr>
+        <w:pStyle w:val="ListBullet"/>
+      </w:pPr>
+      <w:r>
+        <w:t>CASE-MED-0013</w:t>
       </w:r>
     </w:p>
     <w:p>
@@ -1489,7 +1663,7 @@
         <w:pStyle w:val="Heading2"/>
       </w:pPr>
       <w:r>
-        <w:t>Pontos de atenção para o corretor</w:t>
+        <w:t>Tags</w:t>
       </w:r>
     </w:p>
     <w:p>
@@ -1497,7 +1671,7 @@
         <w:pStyle w:val="ListBullet"/>
       </w:pPr>
       <w:r>
-        <w:t>Confirmar produto, apólice e data do evento médico.</w:t>
+        <w:t>dialogue</w:t>
       </w:r>
     </w:p>
     <w:p>
@@ -1505,7 +1679,7 @@
         <w:pStyle w:val="ListBullet"/>
       </w:pPr>
       <w:r>
-        <w:t>Não prometer pagamento antes da análise da seguradora.</w:t>
+        <w:t>med</w:t>
       </w:r>
     </w:p>
     <w:p>
@@ -1513,7 +1687,15 @@
         <w:pStyle w:val="ListBullet"/>
       </w:pPr>
       <w:r>
-        <w:t>Explicar documentos em português simples, sem tradução literal confusa.</w:t>
+        <w:t>atendimento-bilingue</w:t>
+      </w:r>
+    </w:p>
+    <w:p>
+      <w:pPr>
+        <w:pStyle w:val="ListBullet"/>
+      </w:pPr>
+      <w:r>
+        <w:t>notebooklm</w:t>
       </w:r>
     </w:p>
     <w:p>
@@ -1521,7 +1703,7 @@
         <w:pStyle w:val="Heading2"/>
       </w:pPr>
       <w:r>
-        <w:t>Termos relacionados</w:t>
+        <w:t>Veja também</w:t>
       </w:r>
     </w:p>
     <w:p>
@@ -1529,207 +1711,7 @@
         <w:pStyle w:val="ListBullet"/>
       </w:pPr>
       <w:r>
-        <w:t>MED-0029</w:t>
-      </w:r>
-    </w:p>
-    <w:p>
-      <w:pPr>
-        <w:pStyle w:val="ListBullet"/>
-      </w:pPr>
-      <w:r>
-        <w:t>MED-0030</w:t>
-      </w:r>
-    </w:p>
-    <w:p>
-      <w:pPr>
-        <w:pStyle w:val="ListBullet"/>
-      </w:pPr>
-      <w:r>
-        <w:t>MED-0031</w:t>
-      </w:r>
-    </w:p>
-    <w:p>
-      <w:pPr>
-        <w:pStyle w:val="ListBullet"/>
-      </w:pPr>
-      <w:r>
-        <w:t>MED-0032</w:t>
-      </w:r>
-    </w:p>
-    <w:p>
-      <w:pPr>
-        <w:pStyle w:val="Heading2"/>
-      </w:pPr>
-      <w:r>
-        <w:t>FAQs relacionadas</w:t>
-      </w:r>
-    </w:p>
-    <w:p>
-      <w:pPr>
-        <w:pStyle w:val="ListBullet"/>
-      </w:pPr>
-      <w:r>
-        <w:t>FAQ-MED-0029</w:t>
-      </w:r>
-    </w:p>
-    <w:p>
-      <w:pPr>
-        <w:pStyle w:val="ListBullet"/>
-      </w:pPr>
-      <w:r>
-        <w:t>FAQ-MED-0030</w:t>
-      </w:r>
-    </w:p>
-    <w:p>
-      <w:pPr>
-        <w:pStyle w:val="ListBullet"/>
-      </w:pPr>
-      <w:r>
-        <w:t>FAQ-MED-0031</w:t>
-      </w:r>
-    </w:p>
-    <w:p>
-      <w:pPr>
-        <w:pStyle w:val="ListBullet"/>
-      </w:pPr>
-      <w:r>
-        <w:t>FAQ-MED-0032</w:t>
-      </w:r>
-    </w:p>
-    <w:p>
-      <w:pPr>
-        <w:pStyle w:val="Heading2"/>
-      </w:pPr>
-      <w:r>
-        <w:t>Casos relacionados</w:t>
-      </w:r>
-    </w:p>
-    <w:p>
-      <w:pPr>
-        <w:pStyle w:val="ListBullet"/>
-      </w:pPr>
-      <w:r>
-        <w:t>CASE-MED-0013</w:t>
-      </w:r>
-    </w:p>
-    <w:p>
-      <w:pPr>
-        <w:pStyle w:val="Heading2"/>
-      </w:pPr>
-      <w:r>
-        <w:t>Referências cruzadas</w:t>
-      </w:r>
-    </w:p>
-    <w:p>
-      <w:pPr>
-        <w:pStyle w:val="ListBullet"/>
-      </w:pPr>
-      <w:r>
-        <w:t>MED-0029</w:t>
-      </w:r>
-    </w:p>
-    <w:p>
-      <w:pPr>
-        <w:pStyle w:val="ListBullet"/>
-      </w:pPr>
-      <w:r>
-        <w:t>MED-0030</w:t>
-      </w:r>
-    </w:p>
-    <w:p>
-      <w:pPr>
-        <w:pStyle w:val="ListBullet"/>
-      </w:pPr>
-      <w:r>
-        <w:t>MED-0031</w:t>
-      </w:r>
-    </w:p>
-    <w:p>
-      <w:pPr>
-        <w:pStyle w:val="ListBullet"/>
-      </w:pPr>
-      <w:r>
-        <w:t>MED-0032</w:t>
-      </w:r>
-    </w:p>
-    <w:p>
-      <w:pPr>
-        <w:pStyle w:val="ListBullet"/>
-      </w:pPr>
-      <w:r>
-        <w:t>FAQ-MED-0029</w:t>
-      </w:r>
-    </w:p>
-    <w:p>
-      <w:pPr>
-        <w:pStyle w:val="ListBullet"/>
-      </w:pPr>
-      <w:r>
-        <w:t>FAQ-MED-0030</w:t>
-      </w:r>
-    </w:p>
-    <w:p>
-      <w:pPr>
-        <w:pStyle w:val="ListBullet"/>
-      </w:pPr>
-      <w:r>
-        <w:t>FAQ-MED-0031</w:t>
-      </w:r>
-    </w:p>
-    <w:p>
-      <w:pPr>
-        <w:pStyle w:val="ListBullet"/>
-      </w:pPr>
-      <w:r>
-        <w:t>FAQ-MED-0032</w:t>
-      </w:r>
-    </w:p>
-    <w:p>
-      <w:pPr>
-        <w:pStyle w:val="ListBullet"/>
-      </w:pPr>
-      <w:r>
-        <w:t>CASE-MED-0013</w:t>
-      </w:r>
-    </w:p>
-    <w:p>
-      <w:pPr>
-        <w:pStyle w:val="Heading2"/>
-      </w:pPr>
-      <w:r>
-        <w:t>Tags</w:t>
-      </w:r>
-    </w:p>
-    <w:p>
-      <w:pPr>
-        <w:pStyle w:val="ListBullet"/>
-      </w:pPr>
-      <w:r>
-        <w:t>dialogue</w:t>
-      </w:r>
-    </w:p>
-    <w:p>
-      <w:pPr>
-        <w:pStyle w:val="ListBullet"/>
-      </w:pPr>
-      <w:r>
-        <w:t>med</w:t>
-      </w:r>
-    </w:p>
-    <w:p>
-      <w:pPr>
-        <w:pStyle w:val="ListBullet"/>
-      </w:pPr>
-      <w:r>
-        <w:t>solicitacao</w:t>
-      </w:r>
-    </w:p>
-    <w:p>
-      <w:pPr>
-        <w:pStyle w:val="ListBullet"/>
-      </w:pPr>
-      <w:r>
-        <w:t>atendimento</w:t>
+        <w:t>`15_CaseStudies/MED/CASE-MED-0013.md`</w:t>
       </w:r>
     </w:p>
     <w:p>
@@ -1811,7 +1793,7 @@
           </w:tcPr>
           <w:p>
             <w:r>
-              <w:t>0.1</w:t>
+              <w:t>0.2</w:t>
             </w:r>
           </w:p>
         </w:tc>
@@ -1831,7 +1813,7 @@
           </w:tcPr>
           <w:p>
             <w:r>
-              <w:t>Criação inicial.</w:t>
+              <w:t>Normalização bilíngue com versão japonesa e portuguesa.</w:t>
             </w:r>
           </w:p>
         </w:tc>
@@ -1848,7 +1830,7 @@
         <w:pStyle w:val="Heading1"/>
       </w:pPr>
       <w:r>
-        <w:t>DIALOGUE-MED-0009 - Análise, pendências e documentos complementares</w:t>
+        <w:t>DIALOGUE-MED-0009 - Análise de pagamento, pendência e documento complementar</w:t>
       </w:r>
     </w:p>
     <w:p>
@@ -1864,7 +1846,7 @@
         <w:pStyle w:val="ListBullet"/>
       </w:pPr>
       <w:r>
-        <w:t>Versão: 0.1</w:t>
+        <w:t>Versão: 0.2</w:t>
       </w:r>
     </w:p>
     <w:p>
@@ -1888,7 +1870,7 @@
         <w:pStyle w:val="ListBullet"/>
       </w:pPr>
       <w:r>
-        <w:t>Histórico: Criação inicial.</w:t>
+        <w:t>Histórico: Normalização bilíngue para uso por corretor japonês no NotebookLM.</w:t>
       </w:r>
     </w:p>
     <w:p>
@@ -1927,7 +1909,7 @@
     </w:p>
     <w:p>
       <w:r>
-        <w:t>Cliente recebeu pedido de correção ou aguarda decisão.</w:t>
+        <w:t>Cliente enviou documentos e aguarda resposta da seguradora ou recebeu pedido de correção.</w:t>
       </w:r>
     </w:p>
     <w:p>
@@ -1935,12 +1917,36 @@
         <w:pStyle w:val="Heading2"/>
       </w:pPr>
       <w:r>
+        <w:t>Participantes</w:t>
+      </w:r>
+    </w:p>
+    <w:p>
+      <w:pPr>
+        <w:pStyle w:val="ListBullet"/>
+      </w:pPr>
+      <w:r>
+        <w:t>Corretor: corretor japonês</w:t>
+      </w:r>
+    </w:p>
+    <w:p>
+      <w:pPr>
+        <w:pStyle w:val="ListBullet"/>
+      </w:pPr>
+      <w:r>
+        <w:t>Cliente: cliente brasileiro residente no Japão</w:t>
+      </w:r>
+    </w:p>
+    <w:p>
+      <w:pPr>
+        <w:pStyle w:val="Heading2"/>
+      </w:pPr>
+      <w:r>
         <w:t>Objetivo do diálogo</w:t>
       </w:r>
     </w:p>
     <w:p>
       <w:r>
-        <w:t>Explicar em português simples o fluxo de documentos e análise, preservando a precisão do termo japonês.</w:t>
+        <w:t>Explicar que a seguradora analisa o pagamento e pode pedir documentos adicionais.</w:t>
       </w:r>
     </w:p>
     <w:p>
@@ -1948,7 +1954,73 @@
         <w:pStyle w:val="Heading2"/>
       </w:pPr>
       <w:r>
-        <w:t>Diálogo</w:t>
+        <w:t>Versão em japonês</w:t>
+      </w:r>
+    </w:p>
+    <w:p>
+      <w:r>
+        <w:t>**Corretor:** 支払査定は保険会社が契約内容と書類を確認する手続きです。</w:t>
+      </w:r>
+    </w:p>
+    <w:p>
+      <w:r>
+        <w:t>**Cliente:** それはポルトガル語でお客様にどう説明すればよいですか。</w:t>
+      </w:r>
+    </w:p>
+    <w:p>
+      <w:r>
+        <w:t>**Corretor:** 不備がある場合は、追加書類の提出が必要です。</w:t>
+      </w:r>
+    </w:p>
+    <w:p>
+      <w:r>
+        <w:t>**Cliente:** 支払いを約束してもよいですか。</w:t>
+      </w:r>
+    </w:p>
+    <w:p>
+      <w:r>
+        <w:t>**Corretor:** 支払通知が出たら、金額と入金予定日を確認します。</w:t>
+      </w:r>
+    </w:p>
+    <w:p>
+      <w:pPr>
+        <w:pStyle w:val="Heading2"/>
+      </w:pPr>
+      <w:r>
+        <w:t>Versão em português brasileiro</w:t>
+      </w:r>
+    </w:p>
+    <w:p>
+      <w:r>
+        <w:t>**Corretor:** A análise de pagamento é feita pela seguradora com base no contrato e nos documentos.</w:t>
+      </w:r>
+    </w:p>
+    <w:p>
+      <w:r>
+        <w:t>**Cliente:** Então isso já garante o pagamento?</w:t>
+      </w:r>
+    </w:p>
+    <w:p>
+      <w:r>
+        <w:t>**Corretor:** Se houver pendência, precisamos enviar o documento complementar.</w:t>
+      </w:r>
+    </w:p>
+    <w:p>
+      <w:r>
+        <w:t>**Cliente:** O que eu preciso fazer agora?</w:t>
+      </w:r>
+    </w:p>
+    <w:p>
+      <w:r>
+        <w:t>**Corretor:** Quando sair o aviso de pagamento, vamos conferir valor e data prevista de depósito.</w:t>
+      </w:r>
+    </w:p>
+    <w:p>
+      <w:pPr>
+        <w:pStyle w:val="Heading2"/>
+      </w:pPr>
+      <w:r>
+        <w:t>Notas culturais ou comerciais</w:t>
       </w:r>
     </w:p>
     <w:p>
@@ -1956,7 +2028,7 @@
         <w:pStyle w:val="ListBullet"/>
       </w:pPr>
       <w:r>
-        <w:t>Corretor: Vamos organizar a solicitação por etapas.</w:t>
+        <w:t>Confirmar documentos e condições antes de orientar o cliente.</w:t>
       </w:r>
     </w:p>
     <w:p>
@@ -1964,7 +2036,7 @@
         <w:pStyle w:val="ListBullet"/>
       </w:pPr>
       <w:r>
-        <w:t>Cliente: Eu preciso entregar todos os documentos agora?</w:t>
+        <w:t>Não prometer aceitação, cobertura ou pagamento antes da análise da seguradora.</w:t>
       </w:r>
     </w:p>
     <w:p>
@@ -1972,7 +2044,15 @@
         <w:pStyle w:val="ListBullet"/>
       </w:pPr>
       <w:r>
-        <w:t>Corretor: Primeiro confirmamos o tipo de benefício e depois a lista exigida pela seguradora.</w:t>
+        <w:t>Usar português simples e evitar tradução literal quando prejudicar a compreensão.</w:t>
+      </w:r>
+    </w:p>
+    <w:p>
+      <w:pPr>
+        <w:pStyle w:val="Heading2"/>
+      </w:pPr>
+      <w:r>
+        <w:t>Pontos de atenção para o corretor</w:t>
       </w:r>
     </w:p>
     <w:p>
@@ -1980,7 +2060,7 @@
         <w:pStyle w:val="ListBullet"/>
       </w:pPr>
       <w:r>
-        <w:t>Corretor: Vamos confirmar `MED-0033` e os documentos relacionados.</w:t>
+        <w:t>Registrar a dúvida principal do cliente.</w:t>
       </w:r>
     </w:p>
     <w:p>
@@ -1988,7 +2068,7 @@
         <w:pStyle w:val="ListBullet"/>
       </w:pPr>
       <w:r>
-        <w:t>Cliente: Então esse item influencia a análise do benefício?</w:t>
+        <w:t>Separar explicação comercial de decisão formal da seguradora.</w:t>
       </w:r>
     </w:p>
     <w:p>
@@ -1996,7 +2076,15 @@
         <w:pStyle w:val="ListBullet"/>
       </w:pPr>
       <w:r>
-        <w:t>Corretor: Sim. Ele ajuda a seguradora a verificar o contrato e evitar atraso.</w:t>
+        <w:t>Apontar os verbetes e FAQs relacionados quando houver dúvida técnica.</w:t>
+      </w:r>
+    </w:p>
+    <w:p>
+      <w:pPr>
+        <w:pStyle w:val="Heading2"/>
+      </w:pPr>
+      <w:r>
+        <w:t>Termos relacionados</w:t>
       </w:r>
     </w:p>
     <w:p>
@@ -2004,7 +2092,7 @@
         <w:pStyle w:val="ListBullet"/>
       </w:pPr>
       <w:r>
-        <w:t>Corretor: Vamos confirmar `MED-0034` e os documentos relacionados.</w:t>
+        <w:t>MED-0033</w:t>
       </w:r>
     </w:p>
     <w:p>
@@ -2012,7 +2100,7 @@
         <w:pStyle w:val="ListBullet"/>
       </w:pPr>
       <w:r>
-        <w:t>Cliente: Então esse item influencia a análise do benefício?</w:t>
+        <w:t>MED-0034</w:t>
       </w:r>
     </w:p>
     <w:p>
@@ -2020,7 +2108,7 @@
         <w:pStyle w:val="ListBullet"/>
       </w:pPr>
       <w:r>
-        <w:t>Corretor: Sim. Ele ajuda a seguradora a verificar o contrato e evitar atraso.</w:t>
+        <w:t>MED-0035</w:t>
       </w:r>
     </w:p>
     <w:p>
@@ -2028,7 +2116,15 @@
         <w:pStyle w:val="ListBullet"/>
       </w:pPr>
       <w:r>
-        <w:t>Corretor: Vamos confirmar `MED-0035` e os documentos relacionados.</w:t>
+        <w:t>MED-0036</w:t>
+      </w:r>
+    </w:p>
+    <w:p>
+      <w:pPr>
+        <w:pStyle w:val="Heading2"/>
+      </w:pPr>
+      <w:r>
+        <w:t>FAQs relacionadas</w:t>
       </w:r>
     </w:p>
     <w:p>
@@ -2036,7 +2132,7 @@
         <w:pStyle w:val="ListBullet"/>
       </w:pPr>
       <w:r>
-        <w:t>Cliente: Então esse item influencia a análise do benefício?</w:t>
+        <w:t>FAQ-MED-0033</w:t>
       </w:r>
     </w:p>
     <w:p>
@@ -2044,7 +2140,7 @@
         <w:pStyle w:val="ListBullet"/>
       </w:pPr>
       <w:r>
-        <w:t>Corretor: Sim. Ele ajuda a seguradora a verificar o contrato e evitar atraso.</w:t>
+        <w:t>FAQ-MED-0034</w:t>
       </w:r>
     </w:p>
     <w:p>
@@ -2052,7 +2148,7 @@
         <w:pStyle w:val="ListBullet"/>
       </w:pPr>
       <w:r>
-        <w:t>Corretor: Vamos confirmar `MED-0036` e os documentos relacionados.</w:t>
+        <w:t>FAQ-MED-0035</w:t>
       </w:r>
     </w:p>
     <w:p>
@@ -2060,7 +2156,15 @@
         <w:pStyle w:val="ListBullet"/>
       </w:pPr>
       <w:r>
-        <w:t>Cliente: Então esse item influencia a análise do benefício?</w:t>
+        <w:t>FAQ-MED-0036</w:t>
+      </w:r>
+    </w:p>
+    <w:p>
+      <w:pPr>
+        <w:pStyle w:val="Heading2"/>
+      </w:pPr>
+      <w:r>
+        <w:t>Casos relacionados</w:t>
       </w:r>
     </w:p>
     <w:p>
@@ -2068,7 +2172,15 @@
         <w:pStyle w:val="ListBullet"/>
       </w:pPr>
       <w:r>
-        <w:t>Corretor: Sim. Ele ajuda a seguradora a verificar o contrato e evitar atraso.</w:t>
+        <w:t>CASE-MED-0015</w:t>
+      </w:r>
+    </w:p>
+    <w:p>
+      <w:pPr>
+        <w:pStyle w:val="Heading2"/>
+      </w:pPr>
+      <w:r>
+        <w:t>Referências cruzadas</w:t>
       </w:r>
     </w:p>
     <w:p>
@@ -2076,7 +2188,7 @@
         <w:pStyle w:val="ListBullet"/>
       </w:pPr>
       <w:r>
-        <w:t>Cliente: Se faltar alguma coisa, eu perco o direito?</w:t>
+        <w:t>MED-0033</w:t>
       </w:r>
     </w:p>
     <w:p>
@@ -2084,7 +2196,63 @@
         <w:pStyle w:val="ListBullet"/>
       </w:pPr>
       <w:r>
-        <w:t>Corretor: Normalmente a análise fica pendente até a correção, mas precisamos respeitar prazos e instruções da seguradora.</w:t>
+        <w:t>MED-0034</w:t>
+      </w:r>
+    </w:p>
+    <w:p>
+      <w:pPr>
+        <w:pStyle w:val="ListBullet"/>
+      </w:pPr>
+      <w:r>
+        <w:t>MED-0035</w:t>
+      </w:r>
+    </w:p>
+    <w:p>
+      <w:pPr>
+        <w:pStyle w:val="ListBullet"/>
+      </w:pPr>
+      <w:r>
+        <w:t>MED-0036</w:t>
+      </w:r>
+    </w:p>
+    <w:p>
+      <w:pPr>
+        <w:pStyle w:val="ListBullet"/>
+      </w:pPr>
+      <w:r>
+        <w:t>FAQ-MED-0033</w:t>
+      </w:r>
+    </w:p>
+    <w:p>
+      <w:pPr>
+        <w:pStyle w:val="ListBullet"/>
+      </w:pPr>
+      <w:r>
+        <w:t>FAQ-MED-0034</w:t>
+      </w:r>
+    </w:p>
+    <w:p>
+      <w:pPr>
+        <w:pStyle w:val="ListBullet"/>
+      </w:pPr>
+      <w:r>
+        <w:t>FAQ-MED-0035</w:t>
+      </w:r>
+    </w:p>
+    <w:p>
+      <w:pPr>
+        <w:pStyle w:val="ListBullet"/>
+      </w:pPr>
+      <w:r>
+        <w:t>FAQ-MED-0036</w:t>
+      </w:r>
+    </w:p>
+    <w:p>
+      <w:pPr>
+        <w:pStyle w:val="ListBullet"/>
+      </w:pPr>
+      <w:r>
+        <w:t>CASE-MED-0015</w:t>
       </w:r>
     </w:p>
     <w:p>
@@ -2092,7 +2260,7 @@
         <w:pStyle w:val="Heading2"/>
       </w:pPr>
       <w:r>
-        <w:t>Pontos de atenção para o corretor</w:t>
+        <w:t>Tags</w:t>
       </w:r>
     </w:p>
     <w:p>
@@ -2100,7 +2268,7 @@
         <w:pStyle w:val="ListBullet"/>
       </w:pPr>
       <w:r>
-        <w:t>Confirmar produto, apólice e data do evento médico.</w:t>
+        <w:t>dialogue</w:t>
       </w:r>
     </w:p>
     <w:p>
@@ -2108,7 +2276,7 @@
         <w:pStyle w:val="ListBullet"/>
       </w:pPr>
       <w:r>
-        <w:t>Não prometer pagamento antes da análise da seguradora.</w:t>
+        <w:t>med</w:t>
       </w:r>
     </w:p>
     <w:p>
@@ -2116,7 +2284,15 @@
         <w:pStyle w:val="ListBullet"/>
       </w:pPr>
       <w:r>
-        <w:t>Explicar documentos em português simples, sem tradução literal confusa.</w:t>
+        <w:t>atendimento-bilingue</w:t>
+      </w:r>
+    </w:p>
+    <w:p>
+      <w:pPr>
+        <w:pStyle w:val="ListBullet"/>
+      </w:pPr>
+      <w:r>
+        <w:t>notebooklm</w:t>
       </w:r>
     </w:p>
     <w:p>
@@ -2124,7 +2300,7 @@
         <w:pStyle w:val="Heading2"/>
       </w:pPr>
       <w:r>
-        <w:t>Termos relacionados</w:t>
+        <w:t>Veja também</w:t>
       </w:r>
     </w:p>
     <w:p>
@@ -2132,207 +2308,7 @@
         <w:pStyle w:val="ListBullet"/>
       </w:pPr>
       <w:r>
-        <w:t>MED-0033</w:t>
-      </w:r>
-    </w:p>
-    <w:p>
-      <w:pPr>
-        <w:pStyle w:val="ListBullet"/>
-      </w:pPr>
-      <w:r>
-        <w:t>MED-0034</w:t>
-      </w:r>
-    </w:p>
-    <w:p>
-      <w:pPr>
-        <w:pStyle w:val="ListBullet"/>
-      </w:pPr>
-      <w:r>
-        <w:t>MED-0035</w:t>
-      </w:r>
-    </w:p>
-    <w:p>
-      <w:pPr>
-        <w:pStyle w:val="ListBullet"/>
-      </w:pPr>
-      <w:r>
-        <w:t>MED-0036</w:t>
-      </w:r>
-    </w:p>
-    <w:p>
-      <w:pPr>
-        <w:pStyle w:val="Heading2"/>
-      </w:pPr>
-      <w:r>
-        <w:t>FAQs relacionadas</w:t>
-      </w:r>
-    </w:p>
-    <w:p>
-      <w:pPr>
-        <w:pStyle w:val="ListBullet"/>
-      </w:pPr>
-      <w:r>
-        <w:t>FAQ-MED-0033</w:t>
-      </w:r>
-    </w:p>
-    <w:p>
-      <w:pPr>
-        <w:pStyle w:val="ListBullet"/>
-      </w:pPr>
-      <w:r>
-        <w:t>FAQ-MED-0034</w:t>
-      </w:r>
-    </w:p>
-    <w:p>
-      <w:pPr>
-        <w:pStyle w:val="ListBullet"/>
-      </w:pPr>
-      <w:r>
-        <w:t>FAQ-MED-0035</w:t>
-      </w:r>
-    </w:p>
-    <w:p>
-      <w:pPr>
-        <w:pStyle w:val="ListBullet"/>
-      </w:pPr>
-      <w:r>
-        <w:t>FAQ-MED-0036</w:t>
-      </w:r>
-    </w:p>
-    <w:p>
-      <w:pPr>
-        <w:pStyle w:val="Heading2"/>
-      </w:pPr>
-      <w:r>
-        <w:t>Casos relacionados</w:t>
-      </w:r>
-    </w:p>
-    <w:p>
-      <w:pPr>
-        <w:pStyle w:val="ListBullet"/>
-      </w:pPr>
-      <w:r>
-        <w:t>CASE-MED-0015</w:t>
-      </w:r>
-    </w:p>
-    <w:p>
-      <w:pPr>
-        <w:pStyle w:val="Heading2"/>
-      </w:pPr>
-      <w:r>
-        <w:t>Referências cruzadas</w:t>
-      </w:r>
-    </w:p>
-    <w:p>
-      <w:pPr>
-        <w:pStyle w:val="ListBullet"/>
-      </w:pPr>
-      <w:r>
-        <w:t>MED-0033</w:t>
-      </w:r>
-    </w:p>
-    <w:p>
-      <w:pPr>
-        <w:pStyle w:val="ListBullet"/>
-      </w:pPr>
-      <w:r>
-        <w:t>MED-0034</w:t>
-      </w:r>
-    </w:p>
-    <w:p>
-      <w:pPr>
-        <w:pStyle w:val="ListBullet"/>
-      </w:pPr>
-      <w:r>
-        <w:t>MED-0035</w:t>
-      </w:r>
-    </w:p>
-    <w:p>
-      <w:pPr>
-        <w:pStyle w:val="ListBullet"/>
-      </w:pPr>
-      <w:r>
-        <w:t>MED-0036</w:t>
-      </w:r>
-    </w:p>
-    <w:p>
-      <w:pPr>
-        <w:pStyle w:val="ListBullet"/>
-      </w:pPr>
-      <w:r>
-        <w:t>FAQ-MED-0033</w:t>
-      </w:r>
-    </w:p>
-    <w:p>
-      <w:pPr>
-        <w:pStyle w:val="ListBullet"/>
-      </w:pPr>
-      <w:r>
-        <w:t>FAQ-MED-0034</w:t>
-      </w:r>
-    </w:p>
-    <w:p>
-      <w:pPr>
-        <w:pStyle w:val="ListBullet"/>
-      </w:pPr>
-      <w:r>
-        <w:t>FAQ-MED-0035</w:t>
-      </w:r>
-    </w:p>
-    <w:p>
-      <w:pPr>
-        <w:pStyle w:val="ListBullet"/>
-      </w:pPr>
-      <w:r>
-        <w:t>FAQ-MED-0036</w:t>
-      </w:r>
-    </w:p>
-    <w:p>
-      <w:pPr>
-        <w:pStyle w:val="ListBullet"/>
-      </w:pPr>
-      <w:r>
-        <w:t>CASE-MED-0015</w:t>
-      </w:r>
-    </w:p>
-    <w:p>
-      <w:pPr>
-        <w:pStyle w:val="Heading2"/>
-      </w:pPr>
-      <w:r>
-        <w:t>Tags</w:t>
-      </w:r>
-    </w:p>
-    <w:p>
-      <w:pPr>
-        <w:pStyle w:val="ListBullet"/>
-      </w:pPr>
-      <w:r>
-        <w:t>dialogue</w:t>
-      </w:r>
-    </w:p>
-    <w:p>
-      <w:pPr>
-        <w:pStyle w:val="ListBullet"/>
-      </w:pPr>
-      <w:r>
-        <w:t>med</w:t>
-      </w:r>
-    </w:p>
-    <w:p>
-      <w:pPr>
-        <w:pStyle w:val="ListBullet"/>
-      </w:pPr>
-      <w:r>
-        <w:t>solicitacao</w:t>
-      </w:r>
-    </w:p>
-    <w:p>
-      <w:pPr>
-        <w:pStyle w:val="ListBullet"/>
-      </w:pPr>
-      <w:r>
-        <w:t>atendimento</w:t>
+        <w:t>`15_CaseStudies/MED/CASE-MED-0015.md`</w:t>
       </w:r>
     </w:p>
     <w:p>
@@ -2414,7 +2390,7 @@
           </w:tcPr>
           <w:p>
             <w:r>
-              <w:t>0.1</w:t>
+              <w:t>0.2</w:t>
             </w:r>
           </w:p>
         </w:tc>
@@ -2434,7 +2410,7 @@
           </w:tcPr>
           <w:p>
             <w:r>
-              <w:t>Criação inicial.</w:t>
+              <w:t>Normalização bilíngue com versão japonesa e portuguesa.</w:t>
             </w:r>
           </w:p>
         </w:tc>
@@ -2451,7 +2427,7 @@
         <w:pStyle w:val="Heading1"/>
       </w:pPr>
       <w:r>
-        <w:t>DIALOGUE-MED-0010 - Não pagamento, reanálise, depósito e beneficiário</w:t>
+        <w:t>DIALOGUE-MED-0010 - Aviso de não pagamento, reanálise, depósito e beneficiário</w:t>
       </w:r>
     </w:p>
     <w:p>
@@ -2467,7 +2443,7 @@
         <w:pStyle w:val="ListBullet"/>
       </w:pPr>
       <w:r>
-        <w:t>Versão: 0.1</w:t>
+        <w:t>Versão: 0.2</w:t>
       </w:r>
     </w:p>
     <w:p>
@@ -2491,7 +2467,7 @@
         <w:pStyle w:val="ListBullet"/>
       </w:pPr>
       <w:r>
-        <w:t>Histórico: Criação inicial.</w:t>
+        <w:t>Histórico: Normalização bilíngue para uso por corretor japonês no NotebookLM.</w:t>
       </w:r>
     </w:p>
     <w:p>
@@ -2530,7 +2506,7 @@
     </w:p>
     <w:p>
       <w:r>
-        <w:t>Cliente precisa entender decisão, reanálise ou recebimento.</w:t>
+        <w:t>Cliente recebeu decisão da seguradora ou precisa confirmar quem receberá o benefício.</w:t>
       </w:r>
     </w:p>
     <w:p>
@@ -2538,12 +2514,36 @@
         <w:pStyle w:val="Heading2"/>
       </w:pPr>
       <w:r>
+        <w:t>Participantes</w:t>
+      </w:r>
+    </w:p>
+    <w:p>
+      <w:pPr>
+        <w:pStyle w:val="ListBullet"/>
+      </w:pPr>
+      <w:r>
+        <w:t>Corretor: corretor japonês</w:t>
+      </w:r>
+    </w:p>
+    <w:p>
+      <w:pPr>
+        <w:pStyle w:val="ListBullet"/>
+      </w:pPr>
+      <w:r>
+        <w:t>Cliente: cliente brasileiro residente no Japão</w:t>
+      </w:r>
+    </w:p>
+    <w:p>
+      <w:pPr>
+        <w:pStyle w:val="Heading2"/>
+      </w:pPr>
+      <w:r>
         <w:t>Objetivo do diálogo</w:t>
       </w:r>
     </w:p>
     <w:p>
       <w:r>
-        <w:t>Explicar em português simples o fluxo de documentos e análise, preservando a precisão do termo japonês.</w:t>
+        <w:t>Orientar reação segura diante de não pagamento, reanálise e confirmação de depósito.</w:t>
       </w:r>
     </w:p>
     <w:p>
@@ -2551,7 +2551,73 @@
         <w:pStyle w:val="Heading2"/>
       </w:pPr>
       <w:r>
-        <w:t>Diálogo</w:t>
+        <w:t>Versão em japonês</w:t>
+      </w:r>
+    </w:p>
+    <w:p>
+      <w:r>
+        <w:t>**Corretor:** 不支払通知が届いた場合は、まず理由を確認します。</w:t>
+      </w:r>
+    </w:p>
+    <w:p>
+      <w:r>
+        <w:t>**Cliente:** それはポルトガル語でお客様にどう説明すればよいですか。</w:t>
+      </w:r>
+    </w:p>
+    <w:p>
+      <w:r>
+        <w:t>**Corretor:** 新しい資料がある場合は、再査定を相談できることがあります。</w:t>
+      </w:r>
+    </w:p>
+    <w:p>
+      <w:r>
+        <w:t>**Cliente:** 支払いを約束してもよいですか。</w:t>
+      </w:r>
+    </w:p>
+    <w:p>
+      <w:r>
+        <w:t>**Corretor:** 受取人と入金確認は、支払い後の重要な確認事項です。</w:t>
+      </w:r>
+    </w:p>
+    <w:p>
+      <w:pPr>
+        <w:pStyle w:val="Heading2"/>
+      </w:pPr>
+      <w:r>
+        <w:t>Versão em português brasileiro</w:t>
+      </w:r>
+    </w:p>
+    <w:p>
+      <w:r>
+        <w:t>**Corretor:** Se chegar aviso de não pagamento, primeiro precisamos ler o motivo.</w:t>
+      </w:r>
+    </w:p>
+    <w:p>
+      <w:r>
+        <w:t>**Cliente:** Então isso já garante o pagamento?</w:t>
+      </w:r>
+    </w:p>
+    <w:p>
+      <w:r>
+        <w:t>**Corretor:** Se houver documento novo, podemos avaliar pedido de reanálise.</w:t>
+      </w:r>
+    </w:p>
+    <w:p>
+      <w:r>
+        <w:t>**Cliente:** O que eu preciso fazer agora?</w:t>
+      </w:r>
+    </w:p>
+    <w:p>
+      <w:r>
+        <w:t>**Corretor:** Depois da aprovação, confirme beneficiário e entrada do depósito.</w:t>
+      </w:r>
+    </w:p>
+    <w:p>
+      <w:pPr>
+        <w:pStyle w:val="Heading2"/>
+      </w:pPr>
+      <w:r>
+        <w:t>Notas culturais ou comerciais</w:t>
       </w:r>
     </w:p>
     <w:p>
@@ -2559,7 +2625,7 @@
         <w:pStyle w:val="ListBullet"/>
       </w:pPr>
       <w:r>
-        <w:t>Corretor: Vamos organizar a solicitação por etapas.</w:t>
+        <w:t>Confirmar documentos e condições antes de orientar o cliente.</w:t>
       </w:r>
     </w:p>
     <w:p>
@@ -2567,7 +2633,7 @@
         <w:pStyle w:val="ListBullet"/>
       </w:pPr>
       <w:r>
-        <w:t>Cliente: Eu preciso entregar todos os documentos agora?</w:t>
+        <w:t>Não prometer aceitação, cobertura ou pagamento antes da análise da seguradora.</w:t>
       </w:r>
     </w:p>
     <w:p>
@@ -2575,7 +2641,15 @@
         <w:pStyle w:val="ListBullet"/>
       </w:pPr>
       <w:r>
-        <w:t>Corretor: Primeiro confirmamos o tipo de benefício e depois a lista exigida pela seguradora.</w:t>
+        <w:t>Usar português simples e evitar tradução literal quando prejudicar a compreensão.</w:t>
+      </w:r>
+    </w:p>
+    <w:p>
+      <w:pPr>
+        <w:pStyle w:val="Heading2"/>
+      </w:pPr>
+      <w:r>
+        <w:t>Pontos de atenção para o corretor</w:t>
       </w:r>
     </w:p>
     <w:p>
@@ -2583,7 +2657,7 @@
         <w:pStyle w:val="ListBullet"/>
       </w:pPr>
       <w:r>
-        <w:t>Corretor: Vamos confirmar `MED-0037` e os documentos relacionados.</w:t>
+        <w:t>Registrar a dúvida principal do cliente.</w:t>
       </w:r>
     </w:p>
     <w:p>
@@ -2591,7 +2665,7 @@
         <w:pStyle w:val="ListBullet"/>
       </w:pPr>
       <w:r>
-        <w:t>Cliente: Então esse item influencia a análise do benefício?</w:t>
+        <w:t>Separar explicação comercial de decisão formal da seguradora.</w:t>
       </w:r>
     </w:p>
     <w:p>
@@ -2599,7 +2673,15 @@
         <w:pStyle w:val="ListBullet"/>
       </w:pPr>
       <w:r>
-        <w:t>Corretor: Sim. Ele ajuda a seguradora a verificar o contrato e evitar atraso.</w:t>
+        <w:t>Apontar os verbetes e FAQs relacionados quando houver dúvida técnica.</w:t>
+      </w:r>
+    </w:p>
+    <w:p>
+      <w:pPr>
+        <w:pStyle w:val="Heading2"/>
+      </w:pPr>
+      <w:r>
+        <w:t>Termos relacionados</w:t>
       </w:r>
     </w:p>
     <w:p>
@@ -2607,7 +2689,7 @@
         <w:pStyle w:val="ListBullet"/>
       </w:pPr>
       <w:r>
-        <w:t>Corretor: Vamos confirmar `MED-0038` e os documentos relacionados.</w:t>
+        <w:t>MED-0037</w:t>
       </w:r>
     </w:p>
     <w:p>
@@ -2615,7 +2697,7 @@
         <w:pStyle w:val="ListBullet"/>
       </w:pPr>
       <w:r>
-        <w:t>Cliente: Então esse item influencia a análise do benefício?</w:t>
+        <w:t>MED-0038</w:t>
       </w:r>
     </w:p>
     <w:p>
@@ -2623,7 +2705,7 @@
         <w:pStyle w:val="ListBullet"/>
       </w:pPr>
       <w:r>
-        <w:t>Corretor: Sim. Ele ajuda a seguradora a verificar o contrato e evitar atraso.</w:t>
+        <w:t>MED-0039</w:t>
       </w:r>
     </w:p>
     <w:p>
@@ -2631,7 +2713,15 @@
         <w:pStyle w:val="ListBullet"/>
       </w:pPr>
       <w:r>
-        <w:t>Corretor: Vamos confirmar `MED-0039` e os documentos relacionados.</w:t>
+        <w:t>MED-0040</w:t>
+      </w:r>
+    </w:p>
+    <w:p>
+      <w:pPr>
+        <w:pStyle w:val="Heading2"/>
+      </w:pPr>
+      <w:r>
+        <w:t>FAQs relacionadas</w:t>
       </w:r>
     </w:p>
     <w:p>
@@ -2639,7 +2729,7 @@
         <w:pStyle w:val="ListBullet"/>
       </w:pPr>
       <w:r>
-        <w:t>Cliente: Então esse item influencia a análise do benefício?</w:t>
+        <w:t>FAQ-MED-0037</w:t>
       </w:r>
     </w:p>
     <w:p>
@@ -2647,7 +2737,7 @@
         <w:pStyle w:val="ListBullet"/>
       </w:pPr>
       <w:r>
-        <w:t>Corretor: Sim. Ele ajuda a seguradora a verificar o contrato e evitar atraso.</w:t>
+        <w:t>FAQ-MED-0038</w:t>
       </w:r>
     </w:p>
     <w:p>
@@ -2655,7 +2745,7 @@
         <w:pStyle w:val="ListBullet"/>
       </w:pPr>
       <w:r>
-        <w:t>Corretor: Vamos confirmar `MED-0040` e os documentos relacionados.</w:t>
+        <w:t>FAQ-MED-0039</w:t>
       </w:r>
     </w:p>
     <w:p>
@@ -2663,7 +2753,15 @@
         <w:pStyle w:val="ListBullet"/>
       </w:pPr>
       <w:r>
-        <w:t>Cliente: Então esse item influencia a análise do benefício?</w:t>
+        <w:t>FAQ-MED-0040</w:t>
+      </w:r>
+    </w:p>
+    <w:p>
+      <w:pPr>
+        <w:pStyle w:val="Heading2"/>
+      </w:pPr>
+      <w:r>
+        <w:t>Casos relacionados</w:t>
       </w:r>
     </w:p>
     <w:p>
@@ -2671,7 +2769,15 @@
         <w:pStyle w:val="ListBullet"/>
       </w:pPr>
       <w:r>
-        <w:t>Corretor: Sim. Ele ajuda a seguradora a verificar o contrato e evitar atraso.</w:t>
+        <w:t>CASE-MED-0016</w:t>
+      </w:r>
+    </w:p>
+    <w:p>
+      <w:pPr>
+        <w:pStyle w:val="Heading2"/>
+      </w:pPr>
+      <w:r>
+        <w:t>Referências cruzadas</w:t>
       </w:r>
     </w:p>
     <w:p>
@@ -2679,7 +2785,7 @@
         <w:pStyle w:val="ListBullet"/>
       </w:pPr>
       <w:r>
-        <w:t>Cliente: Se faltar alguma coisa, eu perco o direito?</w:t>
+        <w:t>MED-0037</w:t>
       </w:r>
     </w:p>
     <w:p>
@@ -2687,7 +2793,63 @@
         <w:pStyle w:val="ListBullet"/>
       </w:pPr>
       <w:r>
-        <w:t>Corretor: Normalmente a análise fica pendente até a correção, mas precisamos respeitar prazos e instruções da seguradora.</w:t>
+        <w:t>MED-0038</w:t>
+      </w:r>
+    </w:p>
+    <w:p>
+      <w:pPr>
+        <w:pStyle w:val="ListBullet"/>
+      </w:pPr>
+      <w:r>
+        <w:t>MED-0039</w:t>
+      </w:r>
+    </w:p>
+    <w:p>
+      <w:pPr>
+        <w:pStyle w:val="ListBullet"/>
+      </w:pPr>
+      <w:r>
+        <w:t>MED-0040</w:t>
+      </w:r>
+    </w:p>
+    <w:p>
+      <w:pPr>
+        <w:pStyle w:val="ListBullet"/>
+      </w:pPr>
+      <w:r>
+        <w:t>FAQ-MED-0037</w:t>
+      </w:r>
+    </w:p>
+    <w:p>
+      <w:pPr>
+        <w:pStyle w:val="ListBullet"/>
+      </w:pPr>
+      <w:r>
+        <w:t>FAQ-MED-0038</w:t>
+      </w:r>
+    </w:p>
+    <w:p>
+      <w:pPr>
+        <w:pStyle w:val="ListBullet"/>
+      </w:pPr>
+      <w:r>
+        <w:t>FAQ-MED-0039</w:t>
+      </w:r>
+    </w:p>
+    <w:p>
+      <w:pPr>
+        <w:pStyle w:val="ListBullet"/>
+      </w:pPr>
+      <w:r>
+        <w:t>FAQ-MED-0040</w:t>
+      </w:r>
+    </w:p>
+    <w:p>
+      <w:pPr>
+        <w:pStyle w:val="ListBullet"/>
+      </w:pPr>
+      <w:r>
+        <w:t>CASE-MED-0016</w:t>
       </w:r>
     </w:p>
     <w:p>
@@ -2695,7 +2857,7 @@
         <w:pStyle w:val="Heading2"/>
       </w:pPr>
       <w:r>
-        <w:t>Pontos de atenção para o corretor</w:t>
+        <w:t>Tags</w:t>
       </w:r>
     </w:p>
     <w:p>
@@ -2703,7 +2865,7 @@
         <w:pStyle w:val="ListBullet"/>
       </w:pPr>
       <w:r>
-        <w:t>Confirmar produto, apólice e data do evento médico.</w:t>
+        <w:t>dialogue</w:t>
       </w:r>
     </w:p>
     <w:p>
@@ -2711,7 +2873,7 @@
         <w:pStyle w:val="ListBullet"/>
       </w:pPr>
       <w:r>
-        <w:t>Não prometer pagamento antes da análise da seguradora.</w:t>
+        <w:t>med</w:t>
       </w:r>
     </w:p>
     <w:p>
@@ -2719,7 +2881,15 @@
         <w:pStyle w:val="ListBullet"/>
       </w:pPr>
       <w:r>
-        <w:t>Explicar documentos em português simples, sem tradução literal confusa.</w:t>
+        <w:t>atendimento-bilingue</w:t>
+      </w:r>
+    </w:p>
+    <w:p>
+      <w:pPr>
+        <w:pStyle w:val="ListBullet"/>
+      </w:pPr>
+      <w:r>
+        <w:t>notebooklm</w:t>
       </w:r>
     </w:p>
     <w:p>
@@ -2727,7 +2897,7 @@
         <w:pStyle w:val="Heading2"/>
       </w:pPr>
       <w:r>
-        <w:t>Termos relacionados</w:t>
+        <w:t>Veja também</w:t>
       </w:r>
     </w:p>
     <w:p>
@@ -2735,207 +2905,7 @@
         <w:pStyle w:val="ListBullet"/>
       </w:pPr>
       <w:r>
-        <w:t>MED-0037</w:t>
-      </w:r>
-    </w:p>
-    <w:p>
-      <w:pPr>
-        <w:pStyle w:val="ListBullet"/>
-      </w:pPr>
-      <w:r>
-        <w:t>MED-0038</w:t>
-      </w:r>
-    </w:p>
-    <w:p>
-      <w:pPr>
-        <w:pStyle w:val="ListBullet"/>
-      </w:pPr>
-      <w:r>
-        <w:t>MED-0039</w:t>
-      </w:r>
-    </w:p>
-    <w:p>
-      <w:pPr>
-        <w:pStyle w:val="ListBullet"/>
-      </w:pPr>
-      <w:r>
-        <w:t>MED-0040</w:t>
-      </w:r>
-    </w:p>
-    <w:p>
-      <w:pPr>
-        <w:pStyle w:val="Heading2"/>
-      </w:pPr>
-      <w:r>
-        <w:t>FAQs relacionadas</w:t>
-      </w:r>
-    </w:p>
-    <w:p>
-      <w:pPr>
-        <w:pStyle w:val="ListBullet"/>
-      </w:pPr>
-      <w:r>
-        <w:t>FAQ-MED-0037</w:t>
-      </w:r>
-    </w:p>
-    <w:p>
-      <w:pPr>
-        <w:pStyle w:val="ListBullet"/>
-      </w:pPr>
-      <w:r>
-        <w:t>FAQ-MED-0038</w:t>
-      </w:r>
-    </w:p>
-    <w:p>
-      <w:pPr>
-        <w:pStyle w:val="ListBullet"/>
-      </w:pPr>
-      <w:r>
-        <w:t>FAQ-MED-0039</w:t>
-      </w:r>
-    </w:p>
-    <w:p>
-      <w:pPr>
-        <w:pStyle w:val="ListBullet"/>
-      </w:pPr>
-      <w:r>
-        <w:t>FAQ-MED-0040</w:t>
-      </w:r>
-    </w:p>
-    <w:p>
-      <w:pPr>
-        <w:pStyle w:val="Heading2"/>
-      </w:pPr>
-      <w:r>
-        <w:t>Casos relacionados</w:t>
-      </w:r>
-    </w:p>
-    <w:p>
-      <w:pPr>
-        <w:pStyle w:val="ListBullet"/>
-      </w:pPr>
-      <w:r>
-        <w:t>CASE-MED-0017</w:t>
-      </w:r>
-    </w:p>
-    <w:p>
-      <w:pPr>
-        <w:pStyle w:val="Heading2"/>
-      </w:pPr>
-      <w:r>
-        <w:t>Referências cruzadas</w:t>
-      </w:r>
-    </w:p>
-    <w:p>
-      <w:pPr>
-        <w:pStyle w:val="ListBullet"/>
-      </w:pPr>
-      <w:r>
-        <w:t>MED-0037</w:t>
-      </w:r>
-    </w:p>
-    <w:p>
-      <w:pPr>
-        <w:pStyle w:val="ListBullet"/>
-      </w:pPr>
-      <w:r>
-        <w:t>MED-0038</w:t>
-      </w:r>
-    </w:p>
-    <w:p>
-      <w:pPr>
-        <w:pStyle w:val="ListBullet"/>
-      </w:pPr>
-      <w:r>
-        <w:t>MED-0039</w:t>
-      </w:r>
-    </w:p>
-    <w:p>
-      <w:pPr>
-        <w:pStyle w:val="ListBullet"/>
-      </w:pPr>
-      <w:r>
-        <w:t>MED-0040</w:t>
-      </w:r>
-    </w:p>
-    <w:p>
-      <w:pPr>
-        <w:pStyle w:val="ListBullet"/>
-      </w:pPr>
-      <w:r>
-        <w:t>FAQ-MED-0037</w:t>
-      </w:r>
-    </w:p>
-    <w:p>
-      <w:pPr>
-        <w:pStyle w:val="ListBullet"/>
-      </w:pPr>
-      <w:r>
-        <w:t>FAQ-MED-0038</w:t>
-      </w:r>
-    </w:p>
-    <w:p>
-      <w:pPr>
-        <w:pStyle w:val="ListBullet"/>
-      </w:pPr>
-      <w:r>
-        <w:t>FAQ-MED-0039</w:t>
-      </w:r>
-    </w:p>
-    <w:p>
-      <w:pPr>
-        <w:pStyle w:val="ListBullet"/>
-      </w:pPr>
-      <w:r>
-        <w:t>FAQ-MED-0040</w:t>
-      </w:r>
-    </w:p>
-    <w:p>
-      <w:pPr>
-        <w:pStyle w:val="ListBullet"/>
-      </w:pPr>
-      <w:r>
-        <w:t>CASE-MED-0017</w:t>
-      </w:r>
-    </w:p>
-    <w:p>
-      <w:pPr>
-        <w:pStyle w:val="Heading2"/>
-      </w:pPr>
-      <w:r>
-        <w:t>Tags</w:t>
-      </w:r>
-    </w:p>
-    <w:p>
-      <w:pPr>
-        <w:pStyle w:val="ListBullet"/>
-      </w:pPr>
-      <w:r>
-        <w:t>dialogue</w:t>
-      </w:r>
-    </w:p>
-    <w:p>
-      <w:pPr>
-        <w:pStyle w:val="ListBullet"/>
-      </w:pPr>
-      <w:r>
-        <w:t>med</w:t>
-      </w:r>
-    </w:p>
-    <w:p>
-      <w:pPr>
-        <w:pStyle w:val="ListBullet"/>
-      </w:pPr>
-      <w:r>
-        <w:t>solicitacao</w:t>
-      </w:r>
-    </w:p>
-    <w:p>
-      <w:pPr>
-        <w:pStyle w:val="ListBullet"/>
-      </w:pPr>
-      <w:r>
-        <w:t>atendimento</w:t>
+        <w:t>`15_CaseStudies/MED/CASE-MED-0016.md`</w:t>
       </w:r>
     </w:p>
     <w:p>
@@ -3017,7 +2987,7 @@
           </w:tcPr>
           <w:p>
             <w:r>
-              <w:t>0.1</w:t>
+              <w:t>0.2</w:t>
             </w:r>
           </w:p>
         </w:tc>
@@ -3037,7 +3007,7 @@
           </w:tcPr>
           <w:p>
             <w:r>
-              <w:t>Criação inicial.</w:t>
+              <w:t>Normalização bilíngue com versão japonesa e portuguesa.</w:t>
             </w:r>
           </w:p>
         </w:tc>
@@ -3419,7 +3389,6 @@
     <w:rsid w:val="00FC693F"/>
     <w:rPr>
       <w:rFonts w:ascii="Arial" w:hAnsi="Arial" w:eastAsia="Yu Gothic"/>
-      <w:sz w:val="18"/>
     </w:rPr>
   </w:style>
   <w:style w:type="paragraph" w:styleId="Header">

</xml_diff>